<commit_message>
TrainerApplication.docx: add usage chapter and design choices for internal parts
Co-authored-by: Copilot App <223556219+Copilot@users.noreply.github.com>
</commit_message>
<xml_diff>
--- a/Documents/TrainerApplication.docx
+++ b/Documents/TrainerApplication.docx
@@ -86,7 +86,7 @@
           <w:r>
             <w:fldChar w:fldCharType="separate"/>
           </w:r>
-          <w:hyperlink w:anchor="_Toc244109500" w:history="1">
+          <w:hyperlink w:anchor="_Toc244110555" w:history="1">
             <w:r>
               <w:rPr>
                 <w:rStyle w:val="Hyperlink"/>
@@ -114,7 +114,7 @@
                 <w:noProof/>
                 <w:webHidden/>
               </w:rPr>
-              <w:instrText xml:space="preserve"> PAGEREF _Toc244109500 \h </w:instrText>
+              <w:instrText xml:space="preserve"> PAGEREF _Toc244110555 \h </w:instrText>
             </w:r>
             <w:r>
               <w:rPr>
@@ -134,7 +134,7 @@
                 <w:noProof/>
                 <w:webHidden/>
               </w:rPr>
-              <w:t>1</w:t>
+              <w:t>2</w:t>
             </w:r>
             <w:r>
               <w:rPr>
@@ -157,7 +157,7 @@
               <w:lang w:eastAsia="sv-SE"/>
             </w:rPr>
           </w:pPr>
-          <w:hyperlink w:anchor="_Toc244109501" w:history="1">
+          <w:hyperlink w:anchor="_Toc244110556" w:history="1">
             <w:r>
               <w:rPr>
                 <w:rStyle w:val="Hyperlink"/>
@@ -185,7 +185,7 @@
                 <w:noProof/>
                 <w:webHidden/>
               </w:rPr>
-              <w:instrText xml:space="preserve"> PAGEREF _Toc244109501 \h </w:instrText>
+              <w:instrText xml:space="preserve"> PAGEREF _Toc244110556 \h </w:instrText>
             </w:r>
             <w:r>
               <w:rPr>
@@ -205,7 +205,7 @@
                 <w:noProof/>
                 <w:webHidden/>
               </w:rPr>
-              <w:t>1</w:t>
+              <w:t>2</w:t>
             </w:r>
             <w:r>
               <w:rPr>
@@ -228,7 +228,7 @@
               <w:lang w:eastAsia="sv-SE"/>
             </w:rPr>
           </w:pPr>
-          <w:hyperlink w:anchor="_Toc244109502" w:history="1">
+          <w:hyperlink w:anchor="_Toc244110557" w:history="1">
             <w:r>
               <w:rPr>
                 <w:rStyle w:val="Hyperlink"/>
@@ -256,7 +256,7 @@
                 <w:noProof/>
                 <w:webHidden/>
               </w:rPr>
-              <w:instrText xml:space="preserve"> PAGEREF _Toc244109502 \h </w:instrText>
+              <w:instrText xml:space="preserve"> PAGEREF _Toc244110557 \h </w:instrText>
             </w:r>
             <w:r>
               <w:rPr>
@@ -299,7 +299,7 @@
               <w:lang w:eastAsia="sv-SE"/>
             </w:rPr>
           </w:pPr>
-          <w:hyperlink w:anchor="_Toc244109503" w:history="1">
+          <w:hyperlink w:anchor="_Toc244110558" w:history="1">
             <w:r>
               <w:rPr>
                 <w:rStyle w:val="Hyperlink"/>
@@ -327,7 +327,7 @@
                 <w:noProof/>
                 <w:webHidden/>
               </w:rPr>
-              <w:instrText xml:space="preserve"> PAGEREF _Toc244109503 \h </w:instrText>
+              <w:instrText xml:space="preserve"> PAGEREF _Toc244110558 \h </w:instrText>
             </w:r>
             <w:r>
               <w:rPr>
@@ -370,7 +370,7 @@
               <w:lang w:eastAsia="sv-SE"/>
             </w:rPr>
           </w:pPr>
-          <w:hyperlink w:anchor="_Toc244109504" w:history="1">
+          <w:hyperlink w:anchor="_Toc244110559" w:history="1">
             <w:r>
               <w:rPr>
                 <w:rStyle w:val="Hyperlink"/>
@@ -398,7 +398,7 @@
                 <w:noProof/>
                 <w:webHidden/>
               </w:rPr>
-              <w:instrText xml:space="preserve"> PAGEREF _Toc244109504 \h </w:instrText>
+              <w:instrText xml:space="preserve"> PAGEREF _Toc244110559 \h </w:instrText>
             </w:r>
             <w:r>
               <w:rPr>
@@ -418,7 +418,7 @@
                 <w:noProof/>
                 <w:webHidden/>
               </w:rPr>
-              <w:t>3</w:t>
+              <w:t>4</w:t>
             </w:r>
             <w:r>
               <w:rPr>
@@ -441,7 +441,7 @@
               <w:lang w:eastAsia="sv-SE"/>
             </w:rPr>
           </w:pPr>
-          <w:hyperlink w:anchor="_Toc244109505" w:history="1">
+          <w:hyperlink w:anchor="_Toc244110560" w:history="1">
             <w:r>
               <w:rPr>
                 <w:rStyle w:val="Hyperlink"/>
@@ -469,7 +469,7 @@
                 <w:noProof/>
                 <w:webHidden/>
               </w:rPr>
-              <w:instrText xml:space="preserve"> PAGEREF _Toc244109505 \h </w:instrText>
+              <w:instrText xml:space="preserve"> PAGEREF _Toc244110560 \h </w:instrText>
             </w:r>
             <w:r>
               <w:rPr>
@@ -489,7 +489,7 @@
                 <w:noProof/>
                 <w:webHidden/>
               </w:rPr>
-              <w:t>3</w:t>
+              <w:t>5</w:t>
             </w:r>
             <w:r>
               <w:rPr>
@@ -512,7 +512,7 @@
               <w:lang w:eastAsia="sv-SE"/>
             </w:rPr>
           </w:pPr>
-          <w:hyperlink w:anchor="_Toc244109506" w:history="1">
+          <w:hyperlink w:anchor="_Toc244110561" w:history="1">
             <w:r>
               <w:rPr>
                 <w:rStyle w:val="Hyperlink"/>
@@ -540,7 +540,7 @@
                 <w:noProof/>
                 <w:webHidden/>
               </w:rPr>
-              <w:instrText xml:space="preserve"> PAGEREF _Toc244109506 \h </w:instrText>
+              <w:instrText xml:space="preserve"> PAGEREF _Toc244110561 \h </w:instrText>
             </w:r>
             <w:r>
               <w:rPr>
@@ -560,7 +560,7 @@
                 <w:noProof/>
                 <w:webHidden/>
               </w:rPr>
-              <w:t>4</w:t>
+              <w:t>5</w:t>
             </w:r>
             <w:r>
               <w:rPr>
@@ -583,7 +583,7 @@
               <w:lang w:eastAsia="sv-SE"/>
             </w:rPr>
           </w:pPr>
-          <w:hyperlink w:anchor="_Toc244109507" w:history="1">
+          <w:hyperlink w:anchor="_Toc244110562" w:history="1">
             <w:r>
               <w:rPr>
                 <w:rStyle w:val="Hyperlink"/>
@@ -611,7 +611,7 @@
                 <w:noProof/>
                 <w:webHidden/>
               </w:rPr>
-              <w:instrText xml:space="preserve"> PAGEREF _Toc244109507 \h </w:instrText>
+              <w:instrText xml:space="preserve"> PAGEREF _Toc244110562 \h </w:instrText>
             </w:r>
             <w:r>
               <w:rPr>
@@ -631,7 +631,7 @@
                 <w:noProof/>
                 <w:webHidden/>
               </w:rPr>
-              <w:t>5</w:t>
+              <w:t>6</w:t>
             </w:r>
             <w:r>
               <w:rPr>
@@ -654,7 +654,7 @@
               <w:lang w:eastAsia="sv-SE"/>
             </w:rPr>
           </w:pPr>
-          <w:hyperlink w:anchor="_Toc244109508" w:history="1">
+          <w:hyperlink w:anchor="_Toc244110563" w:history="1">
             <w:r>
               <w:rPr>
                 <w:rStyle w:val="Hyperlink"/>
@@ -682,7 +682,7 @@
                 <w:noProof/>
                 <w:webHidden/>
               </w:rPr>
-              <w:instrText xml:space="preserve"> PAGEREF _Toc244109508 \h </w:instrText>
+              <w:instrText xml:space="preserve"> PAGEREF _Toc244110563 \h </w:instrText>
             </w:r>
             <w:r>
               <w:rPr>
@@ -702,7 +702,7 @@
                 <w:noProof/>
                 <w:webHidden/>
               </w:rPr>
-              <w:t>5</w:t>
+              <w:t>6</w:t>
             </w:r>
             <w:r>
               <w:rPr>
@@ -725,7 +725,7 @@
               <w:lang w:eastAsia="sv-SE"/>
             </w:rPr>
           </w:pPr>
-          <w:hyperlink w:anchor="_Toc244109509" w:history="1">
+          <w:hyperlink w:anchor="_Toc244110564" w:history="1">
             <w:r>
               <w:rPr>
                 <w:rStyle w:val="Hyperlink"/>
@@ -753,7 +753,7 @@
                 <w:noProof/>
                 <w:webHidden/>
               </w:rPr>
-              <w:instrText xml:space="preserve"> PAGEREF _Toc244109509 \h </w:instrText>
+              <w:instrText xml:space="preserve"> PAGEREF _Toc244110564 \h </w:instrText>
             </w:r>
             <w:r>
               <w:rPr>
@@ -773,7 +773,7 @@
                 <w:noProof/>
                 <w:webHidden/>
               </w:rPr>
-              <w:t>5</w:t>
+              <w:t>7</w:t>
             </w:r>
             <w:r>
               <w:rPr>
@@ -796,7 +796,7 @@
               <w:lang w:eastAsia="sv-SE"/>
             </w:rPr>
           </w:pPr>
-          <w:hyperlink w:anchor="_Toc244109510" w:history="1">
+          <w:hyperlink w:anchor="_Toc244110565" w:history="1">
             <w:r>
               <w:rPr>
                 <w:rStyle w:val="Hyperlink"/>
@@ -824,7 +824,7 @@
                 <w:noProof/>
                 <w:webHidden/>
               </w:rPr>
-              <w:instrText xml:space="preserve"> PAGEREF _Toc244109510 \h </w:instrText>
+              <w:instrText xml:space="preserve"> PAGEREF _Toc244110565 \h </w:instrText>
             </w:r>
             <w:r>
               <w:rPr>
@@ -844,7 +844,7 @@
                 <w:noProof/>
                 <w:webHidden/>
               </w:rPr>
-              <w:t>6</w:t>
+              <w:t>7</w:t>
             </w:r>
             <w:r>
               <w:rPr>
@@ -867,7 +867,7 @@
               <w:lang w:eastAsia="sv-SE"/>
             </w:rPr>
           </w:pPr>
-          <w:hyperlink w:anchor="_Toc244109511" w:history="1">
+          <w:hyperlink w:anchor="_Toc244110566" w:history="1">
             <w:r>
               <w:rPr>
                 <w:rStyle w:val="Hyperlink"/>
@@ -895,7 +895,7 @@
                 <w:noProof/>
                 <w:webHidden/>
               </w:rPr>
-              <w:instrText xml:space="preserve"> PAGEREF _Toc244109511 \h </w:instrText>
+              <w:instrText xml:space="preserve"> PAGEREF _Toc244110566 \h </w:instrText>
             </w:r>
             <w:r>
               <w:rPr>
@@ -915,7 +915,7 @@
                 <w:noProof/>
                 <w:webHidden/>
               </w:rPr>
-              <w:t>6</w:t>
+              <w:t>8</w:t>
             </w:r>
             <w:r>
               <w:rPr>
@@ -938,7 +938,7 @@
               <w:lang w:eastAsia="sv-SE"/>
             </w:rPr>
           </w:pPr>
-          <w:hyperlink w:anchor="_Toc244109512" w:history="1">
+          <w:hyperlink w:anchor="_Toc244110567" w:history="1">
             <w:r>
               <w:rPr>
                 <w:rStyle w:val="Hyperlink"/>
@@ -966,7 +966,7 @@
                 <w:noProof/>
                 <w:webHidden/>
               </w:rPr>
-              <w:instrText xml:space="preserve"> PAGEREF _Toc244109512 \h </w:instrText>
+              <w:instrText xml:space="preserve"> PAGEREF _Toc244110567 \h </w:instrText>
             </w:r>
             <w:r>
               <w:rPr>
@@ -986,7 +986,7 @@
                 <w:noProof/>
                 <w:webHidden/>
               </w:rPr>
-              <w:t>8</w:t>
+              <w:t>10</w:t>
             </w:r>
             <w:r>
               <w:rPr>
@@ -1009,14 +1009,14 @@
               <w:lang w:eastAsia="sv-SE"/>
             </w:rPr>
           </w:pPr>
-          <w:hyperlink w:anchor="_Toc244109513" w:history="1">
+          <w:hyperlink w:anchor="_Toc244110568" w:history="1">
             <w:r>
               <w:rPr>
                 <w:rStyle w:val="Hyperlink"/>
                 <w:noProof/>
                 <w:lang w:val="en-GB"/>
               </w:rPr>
-              <w:t>2. Capabilities of the application</w:t>
+              <w:t>2. Using the trainer application</w:t>
             </w:r>
             <w:r>
               <w:rPr>
@@ -1037,7 +1037,7 @@
                 <w:noProof/>
                 <w:webHidden/>
               </w:rPr>
-              <w:instrText xml:space="preserve"> PAGEREF _Toc244109513 \h </w:instrText>
+              <w:instrText xml:space="preserve"> PAGEREF _Toc244110568 \h </w:instrText>
             </w:r>
             <w:r>
               <w:rPr>
@@ -1057,7 +1057,7 @@
                 <w:noProof/>
                 <w:webHidden/>
               </w:rPr>
-              <w:t>8</w:t>
+              <w:t>10</w:t>
             </w:r>
             <w:r>
               <w:rPr>
@@ -1080,14 +1080,14 @@
               <w:lang w:eastAsia="sv-SE"/>
             </w:rPr>
           </w:pPr>
-          <w:hyperlink w:anchor="_Toc244109514" w:history="1">
+          <w:hyperlink w:anchor="_Toc244110569" w:history="1">
             <w:r>
               <w:rPr>
                 <w:rStyle w:val="Hyperlink"/>
                 <w:noProof/>
                 <w:lang w:val="en-GB"/>
               </w:rPr>
-              <w:t>2.1 Current capabilities</w:t>
+              <w:t>2.1 Before you start</w:t>
             </w:r>
             <w:r>
               <w:rPr>
@@ -1108,7 +1108,7 @@
                 <w:noProof/>
                 <w:webHidden/>
               </w:rPr>
-              <w:instrText xml:space="preserve"> PAGEREF _Toc244109514 \h </w:instrText>
+              <w:instrText xml:space="preserve"> PAGEREF _Toc244110569 \h </w:instrText>
             </w:r>
             <w:r>
               <w:rPr>
@@ -1128,7 +1128,7 @@
                 <w:noProof/>
                 <w:webHidden/>
               </w:rPr>
-              <w:t>8</w:t>
+              <w:t>10</w:t>
             </w:r>
             <w:r>
               <w:rPr>
@@ -1151,14 +1151,14 @@
               <w:lang w:eastAsia="sv-SE"/>
             </w:rPr>
           </w:pPr>
-          <w:hyperlink w:anchor="_Toc244109515" w:history="1">
+          <w:hyperlink w:anchor="_Toc244110570" w:history="1">
             <w:r>
               <w:rPr>
                 <w:rStyle w:val="Hyperlink"/>
                 <w:noProof/>
                 <w:lang w:val="en-GB"/>
               </w:rPr>
-              <w:t>2.2 Change log</w:t>
+              <w:t>2.2 Step by step</w:t>
             </w:r>
             <w:r>
               <w:rPr>
@@ -1179,7 +1179,7 @@
                 <w:noProof/>
                 <w:webHidden/>
               </w:rPr>
-              <w:instrText xml:space="preserve"> PAGEREF _Toc244109515 \h </w:instrText>
+              <w:instrText xml:space="preserve"> PAGEREF _Toc244110570 \h </w:instrText>
             </w:r>
             <w:r>
               <w:rPr>
@@ -1199,7 +1199,7 @@
                 <w:noProof/>
                 <w:webHidden/>
               </w:rPr>
-              <w:t>9</w:t>
+              <w:t>11</w:t>
             </w:r>
             <w:r>
               <w:rPr>
@@ -1222,14 +1222,14 @@
               <w:lang w:eastAsia="sv-SE"/>
             </w:rPr>
           </w:pPr>
-          <w:hyperlink w:anchor="_Toc244109516" w:history="1">
+          <w:hyperlink w:anchor="_Toc244110571" w:history="1">
             <w:r>
               <w:rPr>
                 <w:rStyle w:val="Hyperlink"/>
                 <w:noProof/>
                 <w:lang w:val="en-GB"/>
               </w:rPr>
-              <w:t>2.3 Possible improvements</w:t>
+              <w:t>2.3 Choosing settings</w:t>
             </w:r>
             <w:r>
               <w:rPr>
@@ -1250,7 +1250,7 @@
                 <w:noProof/>
                 <w:webHidden/>
               </w:rPr>
-              <w:instrText xml:space="preserve"> PAGEREF _Toc244109516 \h </w:instrText>
+              <w:instrText xml:space="preserve"> PAGEREF _Toc244110571 \h </w:instrText>
             </w:r>
             <w:r>
               <w:rPr>
@@ -1270,7 +1270,504 @@
                 <w:noProof/>
                 <w:webHidden/>
               </w:rPr>
-              <w:t>9</w:t>
+              <w:t>11</w:t>
+            </w:r>
+            <w:r>
+              <w:rPr>
+                <w:noProof/>
+                <w:webHidden/>
+              </w:rPr>
+              <w:fldChar w:fldCharType="end"/>
+            </w:r>
+          </w:hyperlink>
+        </w:p>
+        <w:p>
+          <w:pPr>
+            <w:pStyle w:val="TOC2"/>
+            <w:tabs>
+              <w:tab w:val="right" w:leader="dot" w:pos="9062"/>
+            </w:tabs>
+            <w:rPr>
+              <w:rFonts w:eastAsiaTheme="minorEastAsia"/>
+              <w:noProof/>
+              <w:lang w:eastAsia="sv-SE"/>
+            </w:rPr>
+          </w:pPr>
+          <w:hyperlink w:anchor="_Toc244110572" w:history="1">
+            <w:r>
+              <w:rPr>
+                <w:rStyle w:val="Hyperlink"/>
+                <w:noProof/>
+                <w:lang w:val="en-GB"/>
+              </w:rPr>
+              <w:t>2.4 Reading the result</w:t>
+            </w:r>
+            <w:r>
+              <w:rPr>
+                <w:noProof/>
+                <w:webHidden/>
+              </w:rPr>
+              <w:tab/>
+            </w:r>
+            <w:r>
+              <w:rPr>
+                <w:noProof/>
+                <w:webHidden/>
+              </w:rPr>
+              <w:fldChar w:fldCharType="begin"/>
+            </w:r>
+            <w:r>
+              <w:rPr>
+                <w:noProof/>
+                <w:webHidden/>
+              </w:rPr>
+              <w:instrText xml:space="preserve"> PAGEREF _Toc244110572 \h </w:instrText>
+            </w:r>
+            <w:r>
+              <w:rPr>
+                <w:noProof/>
+                <w:webHidden/>
+              </w:rPr>
+            </w:r>
+            <w:r>
+              <w:rPr>
+                <w:noProof/>
+                <w:webHidden/>
+              </w:rPr>
+              <w:fldChar w:fldCharType="separate"/>
+            </w:r>
+            <w:r>
+              <w:rPr>
+                <w:noProof/>
+                <w:webHidden/>
+              </w:rPr>
+              <w:t>11</w:t>
+            </w:r>
+            <w:r>
+              <w:rPr>
+                <w:noProof/>
+                <w:webHidden/>
+              </w:rPr>
+              <w:fldChar w:fldCharType="end"/>
+            </w:r>
+          </w:hyperlink>
+        </w:p>
+        <w:p>
+          <w:pPr>
+            <w:pStyle w:val="TOC2"/>
+            <w:tabs>
+              <w:tab w:val="right" w:leader="dot" w:pos="9062"/>
+            </w:tabs>
+            <w:rPr>
+              <w:rFonts w:eastAsiaTheme="minorEastAsia"/>
+              <w:noProof/>
+              <w:lang w:eastAsia="sv-SE"/>
+            </w:rPr>
+          </w:pPr>
+          <w:hyperlink w:anchor="_Toc244110573" w:history="1">
+            <w:r>
+              <w:rPr>
+                <w:rStyle w:val="Hyperlink"/>
+                <w:noProof/>
+                <w:lang w:val="en-GB"/>
+              </w:rPr>
+              <w:t>2.5 Running the worker from a terminal</w:t>
+            </w:r>
+            <w:r>
+              <w:rPr>
+                <w:noProof/>
+                <w:webHidden/>
+              </w:rPr>
+              <w:tab/>
+            </w:r>
+            <w:r>
+              <w:rPr>
+                <w:noProof/>
+                <w:webHidden/>
+              </w:rPr>
+              <w:fldChar w:fldCharType="begin"/>
+            </w:r>
+            <w:r>
+              <w:rPr>
+                <w:noProof/>
+                <w:webHidden/>
+              </w:rPr>
+              <w:instrText xml:space="preserve"> PAGEREF _Toc244110573 \h </w:instrText>
+            </w:r>
+            <w:r>
+              <w:rPr>
+                <w:noProof/>
+                <w:webHidden/>
+              </w:rPr>
+            </w:r>
+            <w:r>
+              <w:rPr>
+                <w:noProof/>
+                <w:webHidden/>
+              </w:rPr>
+              <w:fldChar w:fldCharType="separate"/>
+            </w:r>
+            <w:r>
+              <w:rPr>
+                <w:noProof/>
+                <w:webHidden/>
+              </w:rPr>
+              <w:t>12</w:t>
+            </w:r>
+            <w:r>
+              <w:rPr>
+                <w:noProof/>
+                <w:webHidden/>
+              </w:rPr>
+              <w:fldChar w:fldCharType="end"/>
+            </w:r>
+          </w:hyperlink>
+        </w:p>
+        <w:p>
+          <w:pPr>
+            <w:pStyle w:val="TOC2"/>
+            <w:tabs>
+              <w:tab w:val="right" w:leader="dot" w:pos="9062"/>
+            </w:tabs>
+            <w:rPr>
+              <w:rFonts w:eastAsiaTheme="minorEastAsia"/>
+              <w:noProof/>
+              <w:lang w:eastAsia="sv-SE"/>
+            </w:rPr>
+          </w:pPr>
+          <w:hyperlink w:anchor="_Toc244110574" w:history="1">
+            <w:r>
+              <w:rPr>
+                <w:rStyle w:val="Hyperlink"/>
+                <w:noProof/>
+                <w:lang w:val="en-GB"/>
+              </w:rPr>
+              <w:t>2.6 Training again</w:t>
+            </w:r>
+            <w:r>
+              <w:rPr>
+                <w:noProof/>
+                <w:webHidden/>
+              </w:rPr>
+              <w:tab/>
+            </w:r>
+            <w:r>
+              <w:rPr>
+                <w:noProof/>
+                <w:webHidden/>
+              </w:rPr>
+              <w:fldChar w:fldCharType="begin"/>
+            </w:r>
+            <w:r>
+              <w:rPr>
+                <w:noProof/>
+                <w:webHidden/>
+              </w:rPr>
+              <w:instrText xml:space="preserve"> PAGEREF _Toc244110574 \h </w:instrText>
+            </w:r>
+            <w:r>
+              <w:rPr>
+                <w:noProof/>
+                <w:webHidden/>
+              </w:rPr>
+            </w:r>
+            <w:r>
+              <w:rPr>
+                <w:noProof/>
+                <w:webHidden/>
+              </w:rPr>
+              <w:fldChar w:fldCharType="separate"/>
+            </w:r>
+            <w:r>
+              <w:rPr>
+                <w:noProof/>
+                <w:webHidden/>
+              </w:rPr>
+              <w:t>12</w:t>
+            </w:r>
+            <w:r>
+              <w:rPr>
+                <w:noProof/>
+                <w:webHidden/>
+              </w:rPr>
+              <w:fldChar w:fldCharType="end"/>
+            </w:r>
+          </w:hyperlink>
+        </w:p>
+        <w:p>
+          <w:pPr>
+            <w:pStyle w:val="TOC1"/>
+            <w:tabs>
+              <w:tab w:val="right" w:leader="dot" w:pos="9062"/>
+            </w:tabs>
+            <w:rPr>
+              <w:rFonts w:eastAsiaTheme="minorEastAsia"/>
+              <w:noProof/>
+              <w:lang w:eastAsia="sv-SE"/>
+            </w:rPr>
+          </w:pPr>
+          <w:hyperlink w:anchor="_Toc244110575" w:history="1">
+            <w:r>
+              <w:rPr>
+                <w:rStyle w:val="Hyperlink"/>
+                <w:noProof/>
+                <w:lang w:val="en-GB"/>
+              </w:rPr>
+              <w:t>3. Capabilities of the application</w:t>
+            </w:r>
+            <w:r>
+              <w:rPr>
+                <w:noProof/>
+                <w:webHidden/>
+              </w:rPr>
+              <w:tab/>
+            </w:r>
+            <w:r>
+              <w:rPr>
+                <w:noProof/>
+                <w:webHidden/>
+              </w:rPr>
+              <w:fldChar w:fldCharType="begin"/>
+            </w:r>
+            <w:r>
+              <w:rPr>
+                <w:noProof/>
+                <w:webHidden/>
+              </w:rPr>
+              <w:instrText xml:space="preserve"> PAGEREF _Toc244110575 \h </w:instrText>
+            </w:r>
+            <w:r>
+              <w:rPr>
+                <w:noProof/>
+                <w:webHidden/>
+              </w:rPr>
+            </w:r>
+            <w:r>
+              <w:rPr>
+                <w:noProof/>
+                <w:webHidden/>
+              </w:rPr>
+              <w:fldChar w:fldCharType="separate"/>
+            </w:r>
+            <w:r>
+              <w:rPr>
+                <w:noProof/>
+                <w:webHidden/>
+              </w:rPr>
+              <w:t>13</w:t>
+            </w:r>
+            <w:r>
+              <w:rPr>
+                <w:noProof/>
+                <w:webHidden/>
+              </w:rPr>
+              <w:fldChar w:fldCharType="end"/>
+            </w:r>
+          </w:hyperlink>
+        </w:p>
+        <w:p>
+          <w:pPr>
+            <w:pStyle w:val="TOC2"/>
+            <w:tabs>
+              <w:tab w:val="right" w:leader="dot" w:pos="9062"/>
+            </w:tabs>
+            <w:rPr>
+              <w:rFonts w:eastAsiaTheme="minorEastAsia"/>
+              <w:noProof/>
+              <w:lang w:eastAsia="sv-SE"/>
+            </w:rPr>
+          </w:pPr>
+          <w:hyperlink w:anchor="_Toc244110576" w:history="1">
+            <w:r>
+              <w:rPr>
+                <w:rStyle w:val="Hyperlink"/>
+                <w:noProof/>
+                <w:lang w:val="en-GB"/>
+              </w:rPr>
+              <w:t>3.1 Current capabilities</w:t>
+            </w:r>
+            <w:r>
+              <w:rPr>
+                <w:noProof/>
+                <w:webHidden/>
+              </w:rPr>
+              <w:tab/>
+            </w:r>
+            <w:r>
+              <w:rPr>
+                <w:noProof/>
+                <w:webHidden/>
+              </w:rPr>
+              <w:fldChar w:fldCharType="begin"/>
+            </w:r>
+            <w:r>
+              <w:rPr>
+                <w:noProof/>
+                <w:webHidden/>
+              </w:rPr>
+              <w:instrText xml:space="preserve"> PAGEREF _Toc244110576 \h </w:instrText>
+            </w:r>
+            <w:r>
+              <w:rPr>
+                <w:noProof/>
+                <w:webHidden/>
+              </w:rPr>
+            </w:r>
+            <w:r>
+              <w:rPr>
+                <w:noProof/>
+                <w:webHidden/>
+              </w:rPr>
+              <w:fldChar w:fldCharType="separate"/>
+            </w:r>
+            <w:r>
+              <w:rPr>
+                <w:noProof/>
+                <w:webHidden/>
+              </w:rPr>
+              <w:t>13</w:t>
+            </w:r>
+            <w:r>
+              <w:rPr>
+                <w:noProof/>
+                <w:webHidden/>
+              </w:rPr>
+              <w:fldChar w:fldCharType="end"/>
+            </w:r>
+          </w:hyperlink>
+        </w:p>
+        <w:p>
+          <w:pPr>
+            <w:pStyle w:val="TOC2"/>
+            <w:tabs>
+              <w:tab w:val="right" w:leader="dot" w:pos="9062"/>
+            </w:tabs>
+            <w:rPr>
+              <w:rFonts w:eastAsiaTheme="minorEastAsia"/>
+              <w:noProof/>
+              <w:lang w:eastAsia="sv-SE"/>
+            </w:rPr>
+          </w:pPr>
+          <w:hyperlink w:anchor="_Toc244110577" w:history="1">
+            <w:r>
+              <w:rPr>
+                <w:rStyle w:val="Hyperlink"/>
+                <w:noProof/>
+                <w:lang w:val="en-GB"/>
+              </w:rPr>
+              <w:t>3.2 Change log</w:t>
+            </w:r>
+            <w:r>
+              <w:rPr>
+                <w:noProof/>
+                <w:webHidden/>
+              </w:rPr>
+              <w:tab/>
+            </w:r>
+            <w:r>
+              <w:rPr>
+                <w:noProof/>
+                <w:webHidden/>
+              </w:rPr>
+              <w:fldChar w:fldCharType="begin"/>
+            </w:r>
+            <w:r>
+              <w:rPr>
+                <w:noProof/>
+                <w:webHidden/>
+              </w:rPr>
+              <w:instrText xml:space="preserve"> PAGEREF _Toc244110577 \h </w:instrText>
+            </w:r>
+            <w:r>
+              <w:rPr>
+                <w:noProof/>
+                <w:webHidden/>
+              </w:rPr>
+            </w:r>
+            <w:r>
+              <w:rPr>
+                <w:noProof/>
+                <w:webHidden/>
+              </w:rPr>
+              <w:fldChar w:fldCharType="separate"/>
+            </w:r>
+            <w:r>
+              <w:rPr>
+                <w:noProof/>
+                <w:webHidden/>
+              </w:rPr>
+              <w:t>13</w:t>
+            </w:r>
+            <w:r>
+              <w:rPr>
+                <w:noProof/>
+                <w:webHidden/>
+              </w:rPr>
+              <w:fldChar w:fldCharType="end"/>
+            </w:r>
+          </w:hyperlink>
+        </w:p>
+        <w:p>
+          <w:pPr>
+            <w:pStyle w:val="TOC2"/>
+            <w:tabs>
+              <w:tab w:val="right" w:leader="dot" w:pos="9062"/>
+            </w:tabs>
+            <w:rPr>
+              <w:rFonts w:eastAsiaTheme="minorEastAsia"/>
+              <w:noProof/>
+              <w:lang w:eastAsia="sv-SE"/>
+            </w:rPr>
+          </w:pPr>
+          <w:hyperlink w:anchor="_Toc244110578" w:history="1">
+            <w:r>
+              <w:rPr>
+                <w:rStyle w:val="Hyperlink"/>
+                <w:noProof/>
+                <w:lang w:val="en-GB"/>
+              </w:rPr>
+              <w:t>3.3 Possible improvements</w:t>
+            </w:r>
+            <w:r>
+              <w:rPr>
+                <w:noProof/>
+                <w:webHidden/>
+              </w:rPr>
+              <w:tab/>
+            </w:r>
+            <w:r>
+              <w:rPr>
+                <w:noProof/>
+                <w:webHidden/>
+              </w:rPr>
+              <w:fldChar w:fldCharType="begin"/>
+            </w:r>
+            <w:r>
+              <w:rPr>
+                <w:noProof/>
+                <w:webHidden/>
+              </w:rPr>
+              <w:instrText xml:space="preserve"> PAGEREF _Toc244110578 \h </w:instrText>
+            </w:r>
+            <w:r>
+              <w:rPr>
+                <w:noProof/>
+                <w:webHidden/>
+              </w:rPr>
+            </w:r>
+            <w:r>
+              <w:rPr>
+                <w:noProof/>
+                <w:webHidden/>
+              </w:rPr>
+              <w:fldChar w:fldCharType="separate"/>
+            </w:r>
+            <w:r>
+              <w:rPr>
+                <w:noProof/>
+                <w:webHidden/>
+              </w:rPr>
+              <w:t>14</w:t>
             </w:r>
             <w:r>
               <w:rPr>
@@ -1308,11 +1805,12 @@
         </w:rPr>
       </w:pPr>
       <w:bookmarkStart w:id="0" w:name="_Toc900001"/>
-      <w:bookmarkStart w:id="1" w:name="_Toc244109500"/>
-      <w:r>
-        <w:rPr>
-          <w:lang w:val="en-GB"/>
-        </w:rPr>
+      <w:bookmarkStart w:id="1" w:name="_Toc244110555"/>
+      <w:r>
+        <w:rPr>
+          <w:lang w:val="en-GB"/>
+        </w:rPr>
+        <w:lastRenderedPageBreak/>
         <w:t>1. Architecture, framework and libraries</w:t>
       </w:r>
       <w:bookmarkEnd w:id="0"/>
@@ -1326,7 +1824,7 @@
         </w:rPr>
       </w:pPr>
       <w:bookmarkStart w:id="2" w:name="_Toc900002"/>
-      <w:bookmarkStart w:id="3" w:name="_Toc244109501"/>
+      <w:bookmarkStart w:id="3" w:name="_Toc244110556"/>
       <w:r>
         <w:rPr>
           <w:lang w:val="en-GB"/>
@@ -1346,13 +1844,7 @@
         <w:rPr>
           <w:lang w:val="en-GB"/>
         </w:rPr>
-        <w:t>SpeciesModelTrainer is a native Windows dialog application written in C++ that trains a bird-species image classifier. It is the second step in the workflow: AIML_ImageExtractor browses videos, extracts and labels bird crops and exports them as a dataset; SpeciesModelTrainer reads that export and produces an ONNX model plus a label file that can later be loaded for species recognition. The dialog itself only collects settings, starts the work, shows the output and allows the user to stop. The training is pe</w:t>
-      </w:r>
-      <w:r>
-        <w:rPr>
-          <w:lang w:val="en-GB"/>
-        </w:rPr>
-        <w:t>rformed by a Python/PyTorch script, train_species.py, which runs as a separate process.</w:t>
+        <w:t>SpeciesModelTrainer is a native Windows dialog application written in C++ that trains a bird-species image classifier. It is the second step in the workflow: AIML_ImageExtractor browses videos, extracts and labels bird crops and exports them as a dataset; SpeciesModelTrainer reads that export and produces an ONNX model plus a label file that can later be loaded for species recognition. The dialog itself only collects settings, starts the work, shows the output and allows the user to stop. The training is performed by a Python/PyTorch script, train_species.py, which runs as a separate process.</w:t>
       </w:r>
     </w:p>
     <w:p>
@@ -1363,7 +1855,7 @@
         </w:rPr>
       </w:pPr>
       <w:bookmarkStart w:id="4" w:name="_Toc900003"/>
-      <w:bookmarkStart w:id="5" w:name="_Toc244109502"/>
+      <w:bookmarkStart w:id="5" w:name="_Toc244110557"/>
       <w:r>
         <w:rPr>
           <w:lang w:val="en-GB"/>
@@ -1383,13 +1875,7 @@
         <w:rPr>
           <w:lang w:val="en-GB"/>
         </w:rPr>
-        <w:t>The application is an MFC dialog-based application created from the Visual Studio wizard and built with the v145 toolset for x64 (Debug and Release). A dialog-based application is the right size for this job: select an exported dataset, choose an output path, set epochs and batch size, start or stop, and read the log. It does not need the document/view architecture that AIML_ImageExtractor uses to display and navigate videos. The project is separate from AIML_ImageExtractor: SpeciesModelTrainer/SpeciesModel</w:t>
-      </w:r>
-      <w:r>
-        <w:rPr>
-          <w:lang w:val="en-GB"/>
-        </w:rPr>
-        <w:t>Trainer.slnx.</w:t>
+        <w:t>The application is an MFC dialog-based application created from the Visual Studio wizard and built with the v145 toolset for x64 (Debug and Release). A dialog-based application is the right size for this job: select an exported dataset, choose an output path, set epochs and batch size, start or stop, and read the log. It does not need the document/view architecture that AIML_ImageExtractor uses to display and navigate videos. The project is separate from AIML_ImageExtractor: SpeciesModelTrainer/SpeciesModelTrainer.slnx.</w:t>
       </w:r>
     </w:p>
     <w:p>
@@ -1413,7 +1899,7 @@
         </w:rPr>
       </w:pPr>
       <w:bookmarkStart w:id="6" w:name="_Toc900004"/>
-      <w:bookmarkStart w:id="7" w:name="_Toc244109503"/>
+      <w:bookmarkStart w:id="7" w:name="_Toc244110558"/>
       <w:r>
         <w:rPr>
           <w:lang w:val="en-GB"/>
@@ -1425,7 +1911,7 @@
     </w:p>
     <w:tbl>
       <w:tblPr>
-        <w:tblW w:w="0" w:type="auto"/>
+        <w:tblW w:w="9060" w:type="dxa"/>
         <w:tblBorders>
           <w:top w:val="single" w:sz="4" w:space="0" w:color="808080"/>
           <w:left w:val="single" w:sz="4" w:space="0" w:color="808080"/>
@@ -1434,17 +1920,18 @@
           <w:insideH w:val="single" w:sz="4" w:space="0" w:color="808080"/>
           <w:insideV w:val="single" w:sz="4" w:space="0" w:color="808080"/>
         </w:tblBorders>
+        <w:tblLayout w:type="fixed"/>
         <w:tblLook w:val="04A0" w:firstRow="1" w:lastRow="0" w:firstColumn="1" w:lastColumn="0" w:noHBand="0" w:noVBand="1"/>
       </w:tblPr>
       <w:tblGrid>
-        <w:gridCol w:w="3019"/>
-        <w:gridCol w:w="3106"/>
-        <w:gridCol w:w="2937"/>
+        <w:gridCol w:w="2100"/>
+        <w:gridCol w:w="2000"/>
+        <w:gridCol w:w="4960"/>
       </w:tblGrid>
       <w:tr>
         <w:tc>
           <w:tcPr>
-            <w:tcW w:w="3024" w:type="dxa"/>
+            <w:tcW w:w="2100" w:type="dxa"/>
           </w:tcPr>
           <w:p>
             <w:r>
@@ -1457,7 +1944,7 @@
         </w:tc>
         <w:tc>
           <w:tcPr>
-            <w:tcW w:w="3024" w:type="dxa"/>
+            <w:tcW w:w="2000" w:type="dxa"/>
           </w:tcPr>
           <w:p>
             <w:r>
@@ -1470,7 +1957,7 @@
         </w:tc>
         <w:tc>
           <w:tcPr>
-            <w:tcW w:w="3024" w:type="dxa"/>
+            <w:tcW w:w="4960" w:type="dxa"/>
           </w:tcPr>
           <w:p>
             <w:r>
@@ -1485,7 +1972,7 @@
       <w:tr>
         <w:tc>
           <w:tcPr>
-            <w:tcW w:w="3024" w:type="dxa"/>
+            <w:tcW w:w="2100" w:type="dxa"/>
           </w:tcPr>
           <w:p>
             <w:r>
@@ -1495,7 +1982,7 @@
         </w:tc>
         <w:tc>
           <w:tcPr>
-            <w:tcW w:w="3024" w:type="dxa"/>
+            <w:tcW w:w="2000" w:type="dxa"/>
           </w:tcPr>
           <w:p>
             <w:r>
@@ -1505,7 +1992,7 @@
         </w:tc>
         <w:tc>
           <w:tcPr>
-            <w:tcW w:w="3024" w:type="dxa"/>
+            <w:tcW w:w="4960" w:type="dxa"/>
           </w:tcPr>
           <w:p>
             <w:pPr>
@@ -1517,7 +2004,7 @@
               <w:rPr>
                 <w:lang w:val="en-GB"/>
               </w:rPr>
-              <w:t>Application object. Initializes MFC and shows the main dialog.</w:t>
+              <w:t>Application object. Initializes MFC and shows the main dialog. Design choice: kept to the wizard-generated minimum; all behaviour is in the dialog, so there is only one place to look.</w:t>
             </w:r>
           </w:p>
         </w:tc>
@@ -1525,7 +2012,7 @@
       <w:tr>
         <w:tc>
           <w:tcPr>
-            <w:tcW w:w="3024" w:type="dxa"/>
+            <w:tcW w:w="2100" w:type="dxa"/>
           </w:tcPr>
           <w:p>
             <w:r>
@@ -1535,7 +2022,7 @@
         </w:tc>
         <w:tc>
           <w:tcPr>
-            <w:tcW w:w="3024" w:type="dxa"/>
+            <w:tcW w:w="2000" w:type="dxa"/>
           </w:tcPr>
           <w:p>
             <w:r>
@@ -1545,7 +2032,7 @@
         </w:tc>
         <w:tc>
           <w:tcPr>
-            <w:tcW w:w="3024" w:type="dxa"/>
+            <w:tcW w:w="4960" w:type="dxa"/>
           </w:tcPr>
           <w:p>
             <w:pPr>
@@ -1557,7 +2044,7 @@
               <w:rPr>
                 <w:lang w:val="en-GB"/>
               </w:rPr>
-              <w:t>The dialog. Validates the input, starts and stops the training worker thread, receives the output of the Python process and writes it to the Training log, and sets the status line.</w:t>
+              <w:t>The dialog. Validates the input, starts and stops the training worker thread, receives the output of the Python process and writes it to the Training log, and sets the status line. Design choice: the dialog contains no training logic. It only validates input, starts the job and displays output, so the worker can be changed or run without the dialog and the dialog never needs to know about PyTorch.</w:t>
             </w:r>
           </w:p>
         </w:tc>
@@ -1565,17 +2052,18 @@
       <w:tr>
         <w:tc>
           <w:tcPr>
-            <w:tcW w:w="3024" w:type="dxa"/>
-          </w:tcPr>
-          <w:p>
-            <w:r>
+            <w:tcW w:w="2100" w:type="dxa"/>
+          </w:tcPr>
+          <w:p>
+            <w:r>
+              <w:lastRenderedPageBreak/>
               <w:t>TrainingThread (static member)</w:t>
             </w:r>
           </w:p>
         </w:tc>
         <w:tc>
           <w:tcPr>
-            <w:tcW w:w="3024" w:type="dxa"/>
+            <w:tcW w:w="2000" w:type="dxa"/>
           </w:tcPr>
           <w:p>
             <w:r>
@@ -1585,7 +2073,7 @@
         </w:tc>
         <w:tc>
           <w:tcPr>
-            <w:tcW w:w="3024" w:type="dxa"/>
+            <w:tcW w:w="4960" w:type="dxa"/>
           </w:tcPr>
           <w:p>
             <w:pPr>
@@ -1597,7 +2085,7 @@
               <w:rPr>
                 <w:lang w:val="en-GB"/>
               </w:rPr>
-              <w:t>MFC worker thread. Creates a pipe, starts python with train_species.py as a hidden process, forwards everything the process writes to the dialog, and reports the exit code.</w:t>
+              <w:t>MFC worker thread. Creates a pipe, starts python with train_species.py as a hidden process, forwards everything the process writes to the dialog, and reports the exit code. Design choice: a worker thread plus a pipe, instead of waiting for the process on the dialog thread, so the window stays responsive and output appears live. Standard output and standard error share one pipe so errors appear in the same order as the progress lines.</w:t>
             </w:r>
           </w:p>
         </w:tc>
@@ -1605,7 +2093,7 @@
       <w:tr>
         <w:tc>
           <w:tcPr>
-            <w:tcW w:w="3024" w:type="dxa"/>
+            <w:tcW w:w="2100" w:type="dxa"/>
           </w:tcPr>
           <w:p>
             <w:r>
@@ -1615,7 +2103,7 @@
         </w:tc>
         <w:tc>
           <w:tcPr>
-            <w:tcW w:w="3024" w:type="dxa"/>
+            <w:tcW w:w="2000" w:type="dxa"/>
           </w:tcPr>
           <w:p>
             <w:r>
@@ -1625,7 +2113,7 @@
         </w:tc>
         <w:tc>
           <w:tcPr>
-            <w:tcW w:w="3024" w:type="dxa"/>
+            <w:tcW w:w="4960" w:type="dxa"/>
           </w:tcPr>
           <w:p>
             <w:pPr>
@@ -1637,7 +2125,7 @@
               <w:rPr>
                 <w:lang w:val="en-GB"/>
               </w:rPr>
-              <w:t>The Python training worker: reads the export, splits it by source video, trains a ResNet18 classifier, exports ONNX and writes the label file.</w:t>
+              <w:t>The Python training worker: reads the export, splits it by source video, trains a ResNet18 classifier, exports ONNX and writes the label file. Design choice: a standalone script with command-line options, so training can be run, tested or scheduled without the dialog and on another machine.</w:t>
             </w:r>
           </w:p>
         </w:tc>
@@ -1645,7 +2133,7 @@
       <w:tr>
         <w:tc>
           <w:tcPr>
-            <w:tcW w:w="3024" w:type="dxa"/>
+            <w:tcW w:w="2100" w:type="dxa"/>
           </w:tcPr>
           <w:p>
             <w:r>
@@ -1655,7 +2143,7 @@
         </w:tc>
         <w:tc>
           <w:tcPr>
-            <w:tcW w:w="3024" w:type="dxa"/>
+            <w:tcW w:w="2000" w:type="dxa"/>
           </w:tcPr>
           <w:p>
             <w:r>
@@ -1665,7 +2153,7 @@
         </w:tc>
         <w:tc>
           <w:tcPr>
-            <w:tcW w:w="3024" w:type="dxa"/>
+            <w:tcW w:w="4960" w:type="dxa"/>
           </w:tcPr>
           <w:p>
             <w:pPr>
@@ -1677,7 +2165,167 @@
               <w:rPr>
                 <w:lang w:val="en-GB"/>
               </w:rPr>
-              <w:t>Python packages needed by the worker: torch, torchvision, Pillow and onnx.</w:t>
+              <w:t>Python packages needed by the worker: torch, torchvision, Pillow and onnx. Design choice: only minimum versions are given, so newer releases are accepted; there is no pinned environment to maintain.</w:t>
+            </w:r>
+          </w:p>
+        </w:tc>
+      </w:tr>
+      <w:tr>
+        <w:tc>
+          <w:tcPr>
+            <w:tcW w:w="2100" w:type="dxa"/>
+          </w:tcPr>
+          <w:p>
+            <w:r>
+              <w:t>read_export (train_species.py)</w:t>
+            </w:r>
+          </w:p>
+        </w:tc>
+        <w:tc>
+          <w:tcPr>
+            <w:tcW w:w="2000" w:type="dxa"/>
+          </w:tcPr>
+          <w:p>
+            <w:r>
+              <w:t>train_species.py</w:t>
+            </w:r>
+          </w:p>
+        </w:tc>
+        <w:tc>
+          <w:tcPr>
+            <w:tcW w:w="4960" w:type="dxa"/>
+          </w:tcPr>
+          <w:p>
+            <w:pPr>
+              <w:rPr>
+                <w:lang w:val="en-GB"/>
+              </w:rPr>
+            </w:pPr>
+            <w:r>
+              <w:rPr>
+                <w:lang w:val="en-GB"/>
+              </w:rPr>
+              <w:t>Reads manifest.csv and builds the list of images with class and source video. Checks the required columns, that every file exists and that no path leaves the export folder. Design choice: all data problems are found before the long training starts and are reported with a clear message. The class is taken from the folder name, so the label can never disagree with the folder layout the user sees.</w:t>
+            </w:r>
+          </w:p>
+        </w:tc>
+      </w:tr>
+      <w:tr>
+        <w:tc>
+          <w:tcPr>
+            <w:tcW w:w="2100" w:type="dxa"/>
+          </w:tcPr>
+          <w:p>
+            <w:r>
+              <w:t>split_by_source (train_species.py)</w:t>
+            </w:r>
+          </w:p>
+        </w:tc>
+        <w:tc>
+          <w:tcPr>
+            <w:tcW w:w="2000" w:type="dxa"/>
+          </w:tcPr>
+          <w:p>
+            <w:r>
+              <w:t>train_species.py</w:t>
+            </w:r>
+          </w:p>
+        </w:tc>
+        <w:tc>
+          <w:tcPr>
+            <w:tcW w:w="4960" w:type="dxa"/>
+          </w:tcPr>
+          <w:p>
+            <w:pPr>
+              <w:rPr>
+                <w:lang w:val="en-GB"/>
+              </w:rPr>
+            </w:pPr>
+            <w:r>
+              <w:rPr>
+                <w:lang w:val="en-GB"/>
+              </w:rPr>
+              <w:t>Divides the images into training and validation by source video. Design choice: it refuses to run instead of falling back to a random split, because a random split would give a misleadingly high accuracy.</w:t>
+            </w:r>
+          </w:p>
+        </w:tc>
+      </w:tr>
+      <w:tr>
+        <w:tc>
+          <w:tcPr>
+            <w:tcW w:w="2100" w:type="dxa"/>
+          </w:tcPr>
+          <w:p>
+            <w:r>
+              <w:t>SpeciesImageDataset (train_species.py)</w:t>
+            </w:r>
+          </w:p>
+        </w:tc>
+        <w:tc>
+          <w:tcPr>
+            <w:tcW w:w="2000" w:type="dxa"/>
+          </w:tcPr>
+          <w:p>
+            <w:r>
+              <w:t>train_species.py</w:t>
+            </w:r>
+          </w:p>
+        </w:tc>
+        <w:tc>
+          <w:tcPr>
+            <w:tcW w:w="4960" w:type="dxa"/>
+          </w:tcPr>
+          <w:p>
+            <w:pPr>
+              <w:rPr>
+                <w:lang w:val="en-GB"/>
+              </w:rPr>
+            </w:pPr>
+            <w:r>
+              <w:rPr>
+                <w:lang w:val="en-GB"/>
+              </w:rPr>
+              <w:t>Loads each PNG when it is needed, converts it to RGB and applies the transforms. Design choice: loading on demand keeps memory use low for large exports; the data loader uses no extra worker processes (num_workers=0), which avoids the complications of child processes on Windows when the script itself is started hidden from a GUI.</w:t>
+            </w:r>
+          </w:p>
+        </w:tc>
+      </w:tr>
+      <w:tr>
+        <w:tc>
+          <w:tcPr>
+            <w:tcW w:w="2100" w:type="dxa"/>
+          </w:tcPr>
+          <w:p>
+            <w:r>
+              <w:t>train (train_species.py)</w:t>
+            </w:r>
+          </w:p>
+        </w:tc>
+        <w:tc>
+          <w:tcPr>
+            <w:tcW w:w="2000" w:type="dxa"/>
+          </w:tcPr>
+          <w:p>
+            <w:r>
+              <w:t>train_species.py</w:t>
+            </w:r>
+          </w:p>
+        </w:tc>
+        <w:tc>
+          <w:tcPr>
+            <w:tcW w:w="4960" w:type="dxa"/>
+          </w:tcPr>
+          <w:p>
+            <w:pPr>
+              <w:rPr>
+                <w:lang w:val="en-GB"/>
+              </w:rPr>
+            </w:pPr>
+            <w:r>
+              <w:rPr>
+                <w:lang w:val="en-GB"/>
+              </w:rPr>
+              <w:t>The training loop: fine-tunes ResNet18, evaluates every epoch on the validation videos, keeps the best epoch, exports ONNX and writes the label file. Design choice: the model is written to a temporary file and renamed, so a failed or stopped run never leaves a half-written model that looks valid.</w:t>
             </w:r>
           </w:p>
         </w:tc>
@@ -1698,7 +2346,7 @@
         </w:rPr>
       </w:pPr>
       <w:bookmarkStart w:id="8" w:name="_Toc900005"/>
-      <w:bookmarkStart w:id="9" w:name="_Toc244109504"/>
+      <w:bookmarkStart w:id="9" w:name="_Toc244110559"/>
       <w:r>
         <w:rPr>
           <w:lang w:val="en-GB"/>
@@ -1710,7 +2358,7 @@
     </w:p>
     <w:tbl>
       <w:tblPr>
-        <w:tblW w:w="0" w:type="auto"/>
+        <w:tblW w:w="9060" w:type="dxa"/>
         <w:tblBorders>
           <w:top w:val="single" w:sz="4" w:space="0" w:color="808080"/>
           <w:left w:val="single" w:sz="4" w:space="0" w:color="808080"/>
@@ -1719,16 +2367,17 @@
           <w:insideH w:val="single" w:sz="4" w:space="0" w:color="808080"/>
           <w:insideV w:val="single" w:sz="4" w:space="0" w:color="808080"/>
         </w:tblBorders>
+        <w:tblLayout w:type="fixed"/>
         <w:tblLook w:val="04A0" w:firstRow="1" w:lastRow="0" w:firstColumn="1" w:lastColumn="0" w:noHBand="0" w:noVBand="1"/>
       </w:tblPr>
       <w:tblGrid>
-        <w:gridCol w:w="4530"/>
-        <w:gridCol w:w="4532"/>
+        <w:gridCol w:w="2300"/>
+        <w:gridCol w:w="6760"/>
       </w:tblGrid>
       <w:tr>
         <w:tc>
           <w:tcPr>
-            <w:tcW w:w="4536" w:type="dxa"/>
+            <w:tcW w:w="2300" w:type="dxa"/>
           </w:tcPr>
           <w:p>
             <w:r>
@@ -1741,7 +2390,7 @@
         </w:tc>
         <w:tc>
           <w:tcPr>
-            <w:tcW w:w="4536" w:type="dxa"/>
+            <w:tcW w:w="6760" w:type="dxa"/>
           </w:tcPr>
           <w:p>
             <w:r>
@@ -1756,7 +2405,7 @@
       <w:tr>
         <w:tc>
           <w:tcPr>
-            <w:tcW w:w="4536" w:type="dxa"/>
+            <w:tcW w:w="2300" w:type="dxa"/>
           </w:tcPr>
           <w:p>
             <w:r>
@@ -1766,7 +2415,7 @@
         </w:tc>
         <w:tc>
           <w:tcPr>
-            <w:tcW w:w="4536" w:type="dxa"/>
+            <w:tcW w:w="6760" w:type="dxa"/>
           </w:tcPr>
           <w:p>
             <w:pPr>
@@ -1786,7 +2435,7 @@
       <w:tr>
         <w:tc>
           <w:tcPr>
-            <w:tcW w:w="4536" w:type="dxa"/>
+            <w:tcW w:w="2300" w:type="dxa"/>
           </w:tcPr>
           <w:p>
             <w:r>
@@ -1796,7 +2445,7 @@
         </w:tc>
         <w:tc>
           <w:tcPr>
-            <w:tcW w:w="4536" w:type="dxa"/>
+            <w:tcW w:w="6760" w:type="dxa"/>
           </w:tcPr>
           <w:p>
             <w:pPr>
@@ -1816,7 +2465,7 @@
       <w:tr>
         <w:tc>
           <w:tcPr>
-            <w:tcW w:w="4536" w:type="dxa"/>
+            <w:tcW w:w="2300" w:type="dxa"/>
           </w:tcPr>
           <w:p>
             <w:r>
@@ -1826,7 +2475,7 @@
         </w:tc>
         <w:tc>
           <w:tcPr>
-            <w:tcW w:w="4536" w:type="dxa"/>
+            <w:tcW w:w="6760" w:type="dxa"/>
           </w:tcPr>
           <w:p>
             <w:pPr>
@@ -1846,7 +2495,7 @@
       <w:tr>
         <w:tc>
           <w:tcPr>
-            <w:tcW w:w="4536" w:type="dxa"/>
+            <w:tcW w:w="2300" w:type="dxa"/>
           </w:tcPr>
           <w:p>
             <w:r>
@@ -1856,7 +2505,7 @@
         </w:tc>
         <w:tc>
           <w:tcPr>
-            <w:tcW w:w="4536" w:type="dxa"/>
+            <w:tcW w:w="6760" w:type="dxa"/>
           </w:tcPr>
           <w:p>
             <w:pPr>
@@ -1876,7 +2525,7 @@
       <w:tr>
         <w:tc>
           <w:tcPr>
-            <w:tcW w:w="4536" w:type="dxa"/>
+            <w:tcW w:w="2300" w:type="dxa"/>
           </w:tcPr>
           <w:p>
             <w:r>
@@ -1886,7 +2535,7 @@
         </w:tc>
         <w:tc>
           <w:tcPr>
-            <w:tcW w:w="4536" w:type="dxa"/>
+            <w:tcW w:w="6760" w:type="dxa"/>
           </w:tcPr>
           <w:p>
             <w:pPr>
@@ -1906,7 +2555,7 @@
       <w:tr>
         <w:tc>
           <w:tcPr>
-            <w:tcW w:w="4536" w:type="dxa"/>
+            <w:tcW w:w="2300" w:type="dxa"/>
           </w:tcPr>
           <w:p>
             <w:r>
@@ -1916,7 +2565,7 @@
         </w:tc>
         <w:tc>
           <w:tcPr>
-            <w:tcW w:w="4536" w:type="dxa"/>
+            <w:tcW w:w="6760" w:type="dxa"/>
           </w:tcPr>
           <w:p>
             <w:pPr>
@@ -1962,7 +2611,7 @@
         </w:rPr>
       </w:pPr>
       <w:bookmarkStart w:id="10" w:name="_Toc900006"/>
-      <w:bookmarkStart w:id="11" w:name="_Toc244109505"/>
+      <w:bookmarkStart w:id="11" w:name="_Toc244110560"/>
       <w:r>
         <w:rPr>
           <w:lang w:val="en-GB"/>
@@ -2036,7 +2685,7 @@
         </w:rPr>
       </w:pPr>
       <w:bookmarkStart w:id="12" w:name="_Toc900007"/>
-      <w:bookmarkStart w:id="13" w:name="_Toc244109506"/>
+      <w:bookmarkStart w:id="13" w:name="_Toc244110561"/>
       <w:r>
         <w:rPr>
           <w:lang w:val="en-GB"/>
@@ -2164,13 +2813,26 @@
     </w:p>
     <w:p>
       <w:pPr>
+        <w:rPr>
+          <w:lang w:val="en-GB"/>
+        </w:rPr>
+      </w:pPr>
+      <w:r>
+        <w:rPr>
+          <w:lang w:val="en-GB"/>
+        </w:rPr>
+        <w:t>Design choice: the dialog checks the simple things itself (empty fields, number format, missing manifest.csv or script) so the user gets an immediate message box. Problems that need the data, for example too few source videos, are found by the worker because it is the one reading the manifest. Only epochs and batch size are in the dialog, because they are the settings a user is likely to change between runs; everything else has a default in the script so the dialog stays simple.</w:t>
+      </w:r>
+    </w:p>
+    <w:p>
+      <w:pPr>
         <w:pStyle w:val="Heading2"/>
         <w:rPr>
           <w:lang w:val="en-GB"/>
         </w:rPr>
       </w:pPr>
       <w:bookmarkStart w:id="14" w:name="_Toc900008"/>
-      <w:bookmarkStart w:id="15" w:name="_Toc244109507"/>
+      <w:bookmarkStart w:id="15" w:name="_Toc244110562"/>
       <w:r>
         <w:rPr>
           <w:lang w:val="en-GB"/>
@@ -2190,13 +2852,7 @@
         <w:rPr>
           <w:lang w:val="en-GB"/>
         </w:rPr>
-        <w:t xml:space="preserve">Training can take minutes to hours, so it never runs on the user interface thread. The dialog thread starts an MFC worker thread, which starts the Python process and polls its pipe every 50 ms. Each chunk of output is decoded from UTF-8 (the worker is started with -X utf8 so that Swedish species names survive) and sent to the dialog with PostMessage(WM_TRAINER_OUTPUT), which appends it to the Training log. When the process has exited and the pipe is empty, the thread posts WM_TRAINER_FINISHED with the exit </w:t>
-      </w:r>
-      <w:r>
-        <w:rPr>
-          <w:lang w:val="en-GB"/>
-        </w:rPr>
-        <w:t>code. Output is posted rather than written directly because MFC controls must only be touched from the thread that owns them.</w:t>
+        <w:t>Training can take minutes to hours, so it never runs on the user interface thread. The dialog thread starts an MFC worker thread, which starts the Python process and polls its pipe every 50 ms. Each chunk of output is decoded from UTF-8 (the worker is started with -X utf8 so that Swedish species names survive) and sent to the dialog with PostMessage(WM_TRAINER_OUTPUT), which appends it to the Training log. When the process has exited and the pipe is empty, the thread posts WM_TRAINER_FINISHED with the exit code. Output is posted rather than written directly because MFC controls must only be touched from the thread that owns them.</w:t>
       </w:r>
     </w:p>
     <w:p>
@@ -2214,13 +2870,26 @@
     </w:p>
     <w:p>
       <w:pPr>
+        <w:rPr>
+          <w:lang w:val="en-GB"/>
+        </w:rPr>
+      </w:pPr>
+      <w:r>
+        <w:rPr>
+          <w:lang w:val="en-GB"/>
+        </w:rPr>
+        <w:t>Design choice: the worker polls the pipe every 50 ms with PeekNamedPipe instead of blocking in ReadFile, so a Stop request is noticed even when the worker prints nothing, for example while the pretrained weights are downloading or during a long epoch. The worker is started with -u and every print uses flush=True so that lines reach the log when they are printed, not when a buffer is full. Stop ends the process instead of asking it to stop, because the training loop has no safe interruption point that can be reached from outside and a partial run has no useful result.</w:t>
+      </w:r>
+    </w:p>
+    <w:p>
+      <w:pPr>
         <w:pStyle w:val="Heading2"/>
         <w:rPr>
           <w:lang w:val="en-GB"/>
         </w:rPr>
       </w:pPr>
       <w:bookmarkStart w:id="16" w:name="_Toc900009"/>
-      <w:bookmarkStart w:id="17" w:name="_Toc244109508"/>
+      <w:bookmarkStart w:id="17" w:name="_Toc244110563"/>
       <w:r>
         <w:rPr>
           <w:lang w:val="en-GB"/>
@@ -2318,13 +2987,26 @@
     </w:p>
     <w:p>
       <w:pPr>
+        <w:rPr>
+          <w:lang w:val="en-GB"/>
+        </w:rPr>
+      </w:pPr>
+      <w:r>
+        <w:rPr>
+          <w:lang w:val="en-GB"/>
+        </w:rPr>
+        <w:t>Design choice: the split is strict. A species with fewer than two source videos stops the run instead of being silently trained without validation, so the reported accuracy always covers every species. One validation video is first assigned to each species that is not yet covered, and only then is the validation share filled up to about 20 % of the videos.</w:t>
+      </w:r>
+    </w:p>
+    <w:p>
+      <w:pPr>
         <w:pStyle w:val="Heading2"/>
         <w:rPr>
           <w:lang w:val="en-GB"/>
         </w:rPr>
       </w:pPr>
       <w:bookmarkStart w:id="18" w:name="_Toc900010"/>
-      <w:bookmarkStart w:id="19" w:name="_Toc244109509"/>
+      <w:bookmarkStart w:id="19" w:name="_Toc244110564"/>
       <w:r>
         <w:rPr>
           <w:lang w:val="en-GB"/>
@@ -2411,13 +3093,26 @@
     </w:p>
     <w:p>
       <w:pPr>
+        <w:rPr>
+          <w:lang w:val="en-GB"/>
+        </w:rPr>
+      </w:pPr>
+      <w:r>
+        <w:rPr>
+          <w:lang w:val="en-GB"/>
+        </w:rPr>
+        <w:t>Design choice: all layers are fine-tuned (not only the last one) because feeder crops are small and blurred and differ from the photographs ImageNet was trained on. The learning rate is small (0.0001) so that the pretrained features are adapted rather than destroyed. The weights of the best epoch are kept, which protects against over-fitting in later epochs. The export is made on the CPU with a fixed 224 x 224 input so the result does not depend on the GPU that was used for training.</w:t>
+      </w:r>
+    </w:p>
+    <w:p>
+      <w:pPr>
         <w:pStyle w:val="Heading2"/>
         <w:rPr>
           <w:lang w:val="en-GB"/>
         </w:rPr>
       </w:pPr>
       <w:bookmarkStart w:id="20" w:name="_Toc900011"/>
-      <w:bookmarkStart w:id="21" w:name="_Toc244109510"/>
+      <w:bookmarkStart w:id="21" w:name="_Toc244110565"/>
       <w:r>
         <w:rPr>
           <w:lang w:val="en-GB"/>
@@ -2528,13 +3223,26 @@
     </w:p>
     <w:p>
       <w:pPr>
+        <w:rPr>
+          <w:lang w:val="en-GB"/>
+        </w:rPr>
+      </w:pPr>
+      <w:r>
+        <w:rPr>
+          <w:lang w:val="en-GB"/>
+        </w:rPr>
+        <w:t>Design choice: one multi-class model instead of one binary model per species. The species compete in one probability distribution, there is one file to deliver, and the code that uses the model is simple. The price is that the model must be retrained when the set of species changes. Sorting the class names makes the output order reproducible for the same set of folders, and the label file records it so that nothing has to be re-derived when the model is used.</w:t>
+      </w:r>
+    </w:p>
+    <w:p>
+      <w:pPr>
         <w:pStyle w:val="Heading2"/>
         <w:rPr>
           <w:lang w:val="en-GB"/>
         </w:rPr>
       </w:pPr>
       <w:bookmarkStart w:id="22" w:name="_Toc900012"/>
-      <w:bookmarkStart w:id="23" w:name="_Toc244109511"/>
+      <w:bookmarkStart w:id="23" w:name="_Toc244110566"/>
       <w:r>
         <w:rPr>
           <w:lang w:val="en-GB"/>
@@ -2632,7 +3340,7 @@
     </w:p>
     <w:tbl>
       <w:tblPr>
-        <w:tblW w:w="0" w:type="auto"/>
+        <w:tblW w:w="9060" w:type="dxa"/>
         <w:tblBorders>
           <w:top w:val="single" w:sz="4" w:space="0" w:color="808080"/>
           <w:left w:val="single" w:sz="4" w:space="0" w:color="808080"/>
@@ -2641,17 +3349,18 @@
           <w:insideH w:val="single" w:sz="4" w:space="0" w:color="808080"/>
           <w:insideV w:val="single" w:sz="4" w:space="0" w:color="808080"/>
         </w:tblBorders>
+        <w:tblLayout w:type="fixed"/>
         <w:tblLook w:val="04A0" w:firstRow="1" w:lastRow="0" w:firstColumn="1" w:lastColumn="0" w:noHBand="0" w:noVBand="1"/>
       </w:tblPr>
       <w:tblGrid>
-        <w:gridCol w:w="3022"/>
-        <w:gridCol w:w="3019"/>
-        <w:gridCol w:w="3021"/>
+        <w:gridCol w:w="3300"/>
+        <w:gridCol w:w="2700"/>
+        <w:gridCol w:w="3060"/>
       </w:tblGrid>
       <w:tr>
         <w:tc>
           <w:tcPr>
-            <w:tcW w:w="3024" w:type="dxa"/>
+            <w:tcW w:w="3300" w:type="dxa"/>
           </w:tcPr>
           <w:p>
             <w:r>
@@ -2664,7 +3373,7 @@
         </w:tc>
         <w:tc>
           <w:tcPr>
-            <w:tcW w:w="3024" w:type="dxa"/>
+            <w:tcW w:w="2700" w:type="dxa"/>
           </w:tcPr>
           <w:p>
             <w:r>
@@ -2677,7 +3386,7 @@
         </w:tc>
         <w:tc>
           <w:tcPr>
-            <w:tcW w:w="3024" w:type="dxa"/>
+            <w:tcW w:w="3060" w:type="dxa"/>
           </w:tcPr>
           <w:p>
             <w:r>
@@ -2692,7 +3401,7 @@
       <w:tr>
         <w:tc>
           <w:tcPr>
-            <w:tcW w:w="3024" w:type="dxa"/>
+            <w:tcW w:w="3300" w:type="dxa"/>
           </w:tcPr>
           <w:p>
             <w:r>
@@ -2702,7 +3411,7 @@
         </w:tc>
         <w:tc>
           <w:tcPr>
-            <w:tcW w:w="3024" w:type="dxa"/>
+            <w:tcW w:w="2700" w:type="dxa"/>
           </w:tcPr>
           <w:p>
             <w:r>
@@ -2712,7 +3421,7 @@
         </w:tc>
         <w:tc>
           <w:tcPr>
-            <w:tcW w:w="3024" w:type="dxa"/>
+            <w:tcW w:w="3060" w:type="dxa"/>
           </w:tcPr>
           <w:p>
             <w:pPr>
@@ -2732,7 +3441,7 @@
       <w:tr>
         <w:tc>
           <w:tcPr>
-            <w:tcW w:w="3024" w:type="dxa"/>
+            <w:tcW w:w="3300" w:type="dxa"/>
           </w:tcPr>
           <w:p>
             <w:r>
@@ -2742,7 +3451,7 @@
         </w:tc>
         <w:tc>
           <w:tcPr>
-            <w:tcW w:w="3024" w:type="dxa"/>
+            <w:tcW w:w="2700" w:type="dxa"/>
           </w:tcPr>
           <w:p>
             <w:r>
@@ -2752,7 +3461,7 @@
         </w:tc>
         <w:tc>
           <w:tcPr>
-            <w:tcW w:w="3024" w:type="dxa"/>
+            <w:tcW w:w="3060" w:type="dxa"/>
           </w:tcPr>
           <w:p>
             <w:pPr>
@@ -2772,7 +3481,7 @@
       <w:tr>
         <w:tc>
           <w:tcPr>
-            <w:tcW w:w="3024" w:type="dxa"/>
+            <w:tcW w:w="3300" w:type="dxa"/>
           </w:tcPr>
           <w:p>
             <w:r>
@@ -2782,7 +3491,7 @@
         </w:tc>
         <w:tc>
           <w:tcPr>
-            <w:tcW w:w="3024" w:type="dxa"/>
+            <w:tcW w:w="2700" w:type="dxa"/>
           </w:tcPr>
           <w:p>
             <w:r>
@@ -2792,7 +3501,7 @@
         </w:tc>
         <w:tc>
           <w:tcPr>
-            <w:tcW w:w="3024" w:type="dxa"/>
+            <w:tcW w:w="3060" w:type="dxa"/>
           </w:tcPr>
           <w:p>
             <w:pPr>
@@ -2812,7 +3521,7 @@
       <w:tr>
         <w:tc>
           <w:tcPr>
-            <w:tcW w:w="3024" w:type="dxa"/>
+            <w:tcW w:w="3300" w:type="dxa"/>
           </w:tcPr>
           <w:p>
             <w:r>
@@ -2822,7 +3531,7 @@
         </w:tc>
         <w:tc>
           <w:tcPr>
-            <w:tcW w:w="3024" w:type="dxa"/>
+            <w:tcW w:w="2700" w:type="dxa"/>
           </w:tcPr>
           <w:p>
             <w:r>
@@ -2832,7 +3541,7 @@
         </w:tc>
         <w:tc>
           <w:tcPr>
-            <w:tcW w:w="3024" w:type="dxa"/>
+            <w:tcW w:w="3060" w:type="dxa"/>
           </w:tcPr>
           <w:p>
             <w:pPr>
@@ -2852,7 +3561,7 @@
       <w:tr>
         <w:tc>
           <w:tcPr>
-            <w:tcW w:w="3024" w:type="dxa"/>
+            <w:tcW w:w="3300" w:type="dxa"/>
           </w:tcPr>
           <w:p>
             <w:r>
@@ -2862,7 +3571,7 @@
         </w:tc>
         <w:tc>
           <w:tcPr>
-            <w:tcW w:w="3024" w:type="dxa"/>
+            <w:tcW w:w="2700" w:type="dxa"/>
           </w:tcPr>
           <w:p>
             <w:r>
@@ -2872,7 +3581,7 @@
         </w:tc>
         <w:tc>
           <w:tcPr>
-            <w:tcW w:w="3024" w:type="dxa"/>
+            <w:tcW w:w="3060" w:type="dxa"/>
           </w:tcPr>
           <w:p>
             <w:pPr>
@@ -2892,7 +3601,7 @@
       <w:tr>
         <w:tc>
           <w:tcPr>
-            <w:tcW w:w="3024" w:type="dxa"/>
+            <w:tcW w:w="3300" w:type="dxa"/>
           </w:tcPr>
           <w:p>
             <w:r>
@@ -2902,7 +3611,7 @@
         </w:tc>
         <w:tc>
           <w:tcPr>
-            <w:tcW w:w="3024" w:type="dxa"/>
+            <w:tcW w:w="2700" w:type="dxa"/>
           </w:tcPr>
           <w:p>
             <w:r>
@@ -2912,7 +3621,7 @@
         </w:tc>
         <w:tc>
           <w:tcPr>
-            <w:tcW w:w="3024" w:type="dxa"/>
+            <w:tcW w:w="3060" w:type="dxa"/>
           </w:tcPr>
           <w:p>
             <w:pPr>
@@ -2932,7 +3641,7 @@
       <w:tr>
         <w:tc>
           <w:tcPr>
-            <w:tcW w:w="3024" w:type="dxa"/>
+            <w:tcW w:w="3300" w:type="dxa"/>
           </w:tcPr>
           <w:p>
             <w:r>
@@ -2942,7 +3651,7 @@
         </w:tc>
         <w:tc>
           <w:tcPr>
-            <w:tcW w:w="3024" w:type="dxa"/>
+            <w:tcW w:w="2700" w:type="dxa"/>
           </w:tcPr>
           <w:p>
             <w:r>
@@ -2952,7 +3661,7 @@
         </w:tc>
         <w:tc>
           <w:tcPr>
-            <w:tcW w:w="3024" w:type="dxa"/>
+            <w:tcW w:w="3060" w:type="dxa"/>
           </w:tcPr>
           <w:p>
             <w:pPr>
@@ -2979,13 +3688,26 @@
     </w:p>
     <w:p>
       <w:pPr>
+        <w:rPr>
+          <w:lang w:val="en-GB"/>
+        </w:rPr>
+      </w:pPr>
+      <w:r>
+        <w:rPr>
+          <w:lang w:val="en-GB"/>
+        </w:rPr>
+        <w:t>Design choice: errors are written into the same log as normal progress, with the prefix ERROR:, instead of being shown in message boxes. A run can fail minutes into training, when the user is not looking at the window; a message box would block a long job that is otherwise finished, while text in the log stays visible and can be copied into a bug report. Message boxes are therefore kept for mistakes that can be detected before the job starts.</w:t>
+      </w:r>
+    </w:p>
+    <w:p>
+      <w:pPr>
         <w:pStyle w:val="Heading2"/>
         <w:rPr>
           <w:lang w:val="en-GB"/>
         </w:rPr>
       </w:pPr>
       <w:bookmarkStart w:id="24" w:name="_Toc900013"/>
-      <w:bookmarkStart w:id="25" w:name="_Toc244109512"/>
+      <w:bookmarkStart w:id="25" w:name="_Toc244110567"/>
       <w:r>
         <w:rPr>
           <w:lang w:val="en-GB"/>
@@ -3092,30 +3814,223 @@
           <w:lang w:val="en-GB"/>
         </w:rPr>
       </w:pPr>
-      <w:bookmarkStart w:id="26" w:name="_Toc244024230"/>
-      <w:bookmarkStart w:id="27" w:name="_Toc900014"/>
-      <w:bookmarkStart w:id="28" w:name="_Toc244109513"/>
-      <w:r>
-        <w:rPr>
-          <w:lang w:val="en-GB"/>
-        </w:rPr>
-        <w:t>2. Capabilities of the application</w:t>
+      <w:bookmarkStart w:id="26" w:name="_Toc244110568"/>
+      <w:r>
+        <w:rPr>
+          <w:lang w:val="en-GB"/>
+        </w:rPr>
+        <w:t>2. Using the trainer application</w:t>
       </w:r>
       <w:bookmarkEnd w:id="26"/>
+    </w:p>
+    <w:p>
+      <w:pPr>
+        <w:rPr>
+          <w:lang w:val="en-GB"/>
+        </w:rPr>
+      </w:pPr>
+      <w:r>
+        <w:rPr>
+          <w:lang w:val="en-GB"/>
+        </w:rPr>
+        <w:t>This chapter describes how the trainer is used from the first export to a finished model. The internal parts it refers to are described in chapter 1.</w:t>
+      </w:r>
+    </w:p>
+    <w:p>
+      <w:pPr>
+        <w:pStyle w:val="Heading2"/>
+        <w:rPr>
+          <w:lang w:val="en-GB"/>
+        </w:rPr>
+      </w:pPr>
+      <w:bookmarkStart w:id="27" w:name="_Toc244110569"/>
+      <w:r>
+        <w:rPr>
+          <w:lang w:val="en-GB"/>
+        </w:rPr>
+        <w:t>2.1 Before you start</w:t>
+      </w:r>
       <w:bookmarkEnd w:id="27"/>
+    </w:p>
+    <w:p>
+      <w:pPr>
+        <w:pStyle w:val="ListParagraph"/>
+        <w:ind w:left="360" w:hanging="240"/>
+        <w:rPr>
+          <w:lang w:val="en-GB"/>
+        </w:rPr>
+      </w:pPr>
+      <w:r>
+        <w:rPr>
+          <w:lang w:val="en-GB"/>
+        </w:rPr>
+        <w:t>•  Build SpeciesModelTrainer (Debug or Release, x64) or use an existing build. The build copies train_species.py to the same folder as SpeciesModelTrainer.exe. The script must stay beside the executable; if the executable is moved, move the script with it.</w:t>
+      </w:r>
+    </w:p>
+    <w:p>
+      <w:pPr>
+        <w:pStyle w:val="ListParagraph"/>
+        <w:ind w:left="360" w:hanging="240"/>
+        <w:rPr>
+          <w:lang w:val="en-GB"/>
+        </w:rPr>
+      </w:pPr>
+      <w:r>
+        <w:rPr>
+          <w:lang w:val="en-GB"/>
+        </w:rPr>
+        <w:t>•  Install Python 3.10 or later with python on PATH, then run python -m pip install -r requirements.txt in the SpeciesModelTrainer folder. The first training run with pretrained weights needs network access.</w:t>
+      </w:r>
+    </w:p>
+    <w:p>
+      <w:pPr>
+        <w:pStyle w:val="ListParagraph"/>
+        <w:ind w:left="360" w:hanging="240"/>
+        <w:rPr>
+          <w:lang w:val="en-GB"/>
+        </w:rPr>
+      </w:pPr>
+      <w:r>
+        <w:rPr>
+          <w:lang w:val="en-GB"/>
+        </w:rPr>
+        <w:t>•  Prepare the data in AIML_ImageExtractor: label bird crops with species, then use File &gt; Export dataset. Every species that is to be recognised needs crops from at least two different videos, and preferably many more crops and more varied videos. Crops from many different videos are worth more than many frames from one video.</w:t>
+      </w:r>
+    </w:p>
+    <w:p>
+      <w:pPr>
+        <w:pStyle w:val="Heading2"/>
+        <w:rPr>
+          <w:lang w:val="en-GB"/>
+        </w:rPr>
+      </w:pPr>
+      <w:bookmarkStart w:id="28" w:name="_Toc244110570"/>
+      <w:r>
+        <w:rPr>
+          <w:lang w:val="en-GB"/>
+        </w:rPr>
+        <w:t>2.2 Step by step</w:t>
+      </w:r>
       <w:bookmarkEnd w:id="28"/>
     </w:p>
     <w:p>
       <w:pPr>
-        <w:rPr>
-          <w:lang w:val="en-GB"/>
-        </w:rPr>
-      </w:pPr>
-      <w:r>
-        <w:rPr>
-          <w:lang w:val="en-GB"/>
-        </w:rPr>
-        <w:t>This section lists what the application can do. It is updated whenever a new request is implemented.</w:t>
+        <w:pStyle w:val="ListParagraph"/>
+        <w:ind w:left="360" w:hanging="240"/>
+        <w:rPr>
+          <w:lang w:val="en-GB"/>
+        </w:rPr>
+      </w:pPr>
+      <w:r>
+        <w:rPr>
+          <w:lang w:val="en-GB"/>
+        </w:rPr>
+        <w:t>•  Start SpeciesModelTrainer. The status line reads "Ready. Training requires Python, PyTorch, torchvision, Pillow, and ONNX."</w:t>
+      </w:r>
+    </w:p>
+    <w:p>
+      <w:pPr>
+        <w:pStyle w:val="ListParagraph"/>
+        <w:ind w:left="360" w:hanging="240"/>
+        <w:rPr>
+          <w:lang w:val="en-GB"/>
+        </w:rPr>
+      </w:pPr>
+      <w:r>
+        <w:rPr>
+          <w:lang w:val="en-GB"/>
+        </w:rPr>
+        <w:t>•  Press Browse... next to Dataset export and select the export folder itself, the one that contains manifest.csv. Pressing Start with a folder that has no manifest.csv gives a message box.</w:t>
+      </w:r>
+    </w:p>
+    <w:p>
+      <w:pPr>
+        <w:pStyle w:val="ListParagraph"/>
+        <w:ind w:left="360" w:hanging="240"/>
+        <w:rPr>
+          <w:lang w:val="en-GB"/>
+        </w:rPr>
+      </w:pPr>
+      <w:r>
+        <w:rPr>
+          <w:lang w:val="en-GB"/>
+        </w:rPr>
+        <w:t>•  Press Browse... next to Output ONNX model and choose where the model is written. The default is species_model.onnx. The label file is written next to it with the extension .labels.json.</w:t>
+      </w:r>
+    </w:p>
+    <w:p>
+      <w:pPr>
+        <w:pStyle w:val="ListParagraph"/>
+        <w:ind w:left="360" w:hanging="240"/>
+        <w:rPr>
+          <w:lang w:val="en-GB"/>
+        </w:rPr>
+      </w:pPr>
+      <w:r>
+        <w:rPr>
+          <w:lang w:val="en-GB"/>
+        </w:rPr>
+        <w:t>•  Set Epochs (default 10) and Batch size (default 16); see section 2.3.</w:t>
+      </w:r>
+    </w:p>
+    <w:p>
+      <w:pPr>
+        <w:pStyle w:val="ListParagraph"/>
+        <w:ind w:left="360" w:hanging="240"/>
+        <w:rPr>
+          <w:lang w:val="en-GB"/>
+        </w:rPr>
+      </w:pPr>
+      <w:r>
+        <w:rPr>
+          <w:lang w:val="en-GB"/>
+        </w:rPr>
+        <w:t>•  Press Start training. The input fields and Start are disabled, Stop is enabled and the Training log shows "Starting Python training worker...".</w:t>
+      </w:r>
+    </w:p>
+    <w:p>
+      <w:pPr>
+        <w:pStyle w:val="ListParagraph"/>
+        <w:ind w:left="360" w:hanging="240"/>
+        <w:rPr>
+          <w:lang w:val="en-GB"/>
+        </w:rPr>
+      </w:pPr>
+      <w:r>
+        <w:rPr>
+          <w:lang w:val="en-GB"/>
+        </w:rPr>
+        <w:t>•  Follow the Training log. A DATASET line shows the number of images, classes and the training/validation split. An EPOCH line is added after each epoch. The log may be quiet for a while at the very start, because the pretrained weights are downloaded the first time.</w:t>
+      </w:r>
+    </w:p>
+    <w:p>
+      <w:pPr>
+        <w:pStyle w:val="ListParagraph"/>
+        <w:ind w:left="360" w:hanging="240"/>
+        <w:rPr>
+          <w:lang w:val="en-GB"/>
+        </w:rPr>
+      </w:pPr>
+      <w:r>
+        <w:rPr>
+          <w:lang w:val="en-GB"/>
+        </w:rPr>
+        <w:t>•  When the status line shows "Training complete." the last log line begins with COMPLETE and names the model, the label file and the best validation accuracy. If it shows "Training failed. See the log for details." read the last lines of the Training log and use the table in section 1.11.</w:t>
+      </w:r>
+    </w:p>
+    <w:p>
+      <w:pPr>
+        <w:pStyle w:val="ListParagraph"/>
+        <w:ind w:left="360" w:hanging="240"/>
+        <w:rPr>
+          <w:lang w:val="en-GB"/>
+        </w:rPr>
+      </w:pPr>
+      <w:r>
+        <w:rPr>
+          <w:lang w:val="en-GB"/>
+        </w:rPr>
+        <w:t>•  To end a run early press Stop; the status line shows "Training stopped." and no model is written for that run.</w:t>
       </w:r>
     </w:p>
     <w:p>
@@ -3125,15 +4040,89 @@
           <w:lang w:val="en-GB"/>
         </w:rPr>
       </w:pPr>
-      <w:bookmarkStart w:id="29" w:name="_Toc900015"/>
-      <w:bookmarkStart w:id="30" w:name="_Toc244109514"/>
-      <w:r>
-        <w:rPr>
-          <w:lang w:val="en-GB"/>
-        </w:rPr>
-        <w:t>2.1 Current capabilities</w:t>
+      <w:bookmarkStart w:id="29" w:name="_Toc244110571"/>
+      <w:r>
+        <w:rPr>
+          <w:lang w:val="en-GB"/>
+        </w:rPr>
+        <w:t>2.3 Choosing settings</w:t>
       </w:r>
       <w:bookmarkEnd w:id="29"/>
+    </w:p>
+    <w:p>
+      <w:pPr>
+        <w:pStyle w:val="ListParagraph"/>
+        <w:ind w:left="360" w:hanging="240"/>
+        <w:rPr>
+          <w:lang w:val="en-GB"/>
+        </w:rPr>
+      </w:pPr>
+      <w:r>
+        <w:rPr>
+          <w:lang w:val="en-GB"/>
+        </w:rPr>
+        <w:t>•  Epochs: ten is a starting point. If validation_accuracy is still rising at the last EPOCH line, run again with more epochs. If the loss keeps falling but the validation accuracy goes down, the model is over-fitting; this does no harm to the result because the best epoch is the one that is saved, but more epochs will not help.</w:t>
+      </w:r>
+    </w:p>
+    <w:p>
+      <w:pPr>
+        <w:pStyle w:val="ListParagraph"/>
+        <w:ind w:left="360" w:hanging="240"/>
+        <w:rPr>
+          <w:lang w:val="en-GB"/>
+        </w:rPr>
+      </w:pPr>
+      <w:r>
+        <w:rPr>
+          <w:lang w:val="en-GB"/>
+        </w:rPr>
+        <w:t>•  Batch size: 16 suits most computers. Use a smaller value (8 or 4) if the log shows an out-of-memory error. A larger value can speed up training on a GPU.</w:t>
+      </w:r>
+    </w:p>
+    <w:p>
+      <w:pPr>
+        <w:pStyle w:val="ListParagraph"/>
+        <w:ind w:left="360" w:hanging="240"/>
+        <w:rPr>
+          <w:lang w:val="en-GB"/>
+        </w:rPr>
+      </w:pPr>
+      <w:r>
+        <w:rPr>
+          <w:lang w:val="en-GB"/>
+        </w:rPr>
+        <w:t>•  Time: the training time grows with the number of images and the number of epochs, and is much shorter with a CUDA GPU than on a CPU. Test the setup with 1-2 epochs before starting a long run.</w:t>
+      </w:r>
+    </w:p>
+    <w:p>
+      <w:pPr>
+        <w:pStyle w:val="ListParagraph"/>
+        <w:ind w:left="360" w:hanging="240"/>
+        <w:rPr>
+          <w:lang w:val="en-GB"/>
+        </w:rPr>
+      </w:pPr>
+      <w:r>
+        <w:rPr>
+          <w:lang w:val="en-GB"/>
+        </w:rPr>
+        <w:t>•  Settings that are not in the dialog (learning rate, validation fraction, seed, threads, CPU only, no pretrained weights) are set by running train_species.py from a terminal, see section 2.5.</w:t>
+      </w:r>
+    </w:p>
+    <w:p>
+      <w:pPr>
+        <w:pStyle w:val="Heading2"/>
+        <w:rPr>
+          <w:lang w:val="en-GB"/>
+        </w:rPr>
+      </w:pPr>
+      <w:bookmarkStart w:id="30" w:name="_Toc244110572"/>
+      <w:r>
+        <w:rPr>
+          <w:lang w:val="en-GB"/>
+        </w:rPr>
+        <w:t>2.4 Reading the result</w:t>
+      </w:r>
       <w:bookmarkEnd w:id="30"/>
     </w:p>
     <w:p>
@@ -3148,127 +4137,37 @@
         <w:rPr>
           <w:lang w:val="en-GB"/>
         </w:rPr>
-        <w:t>•  Select a dataset export folder (File &gt; Export dataset output from AIML_ImageExtractor) and an output .onnx path with browse dialogs.</w:t>
-      </w:r>
-    </w:p>
-    <w:p>
-      <w:pPr>
-        <w:pStyle w:val="ListParagraph"/>
-        <w:ind w:left="360" w:hanging="240"/>
-        <w:rPr>
-          <w:lang w:val="en-GB"/>
-        </w:rPr>
-      </w:pPr>
-      <w:r>
-        <w:rPr>
-          <w:lang w:val="en-GB"/>
-        </w:rPr>
-        <w:t>•  Set the number of epochs and the batch size; both are validated before a run starts.</w:t>
-      </w:r>
-    </w:p>
-    <w:p>
-      <w:pPr>
-        <w:pStyle w:val="ListParagraph"/>
-        <w:ind w:left="360" w:hanging="240"/>
-        <w:rPr>
-          <w:lang w:val="en-GB"/>
-        </w:rPr>
-      </w:pPr>
-      <w:r>
-        <w:rPr>
-          <w:lang w:val="en-GB"/>
-        </w:rPr>
-        <w:t>•  Train a ResNet18 species classifier with ImageNet pretrained weights in a separate Python process while the dialog stays responsive.</w:t>
-      </w:r>
-    </w:p>
-    <w:p>
-      <w:pPr>
-        <w:pStyle w:val="ListParagraph"/>
-        <w:ind w:left="360" w:hanging="240"/>
-        <w:rPr>
-          <w:lang w:val="en-GB"/>
-        </w:rPr>
-      </w:pPr>
-      <w:r>
-        <w:rPr>
-          <w:lang w:val="en-GB"/>
-        </w:rPr>
-        <w:t>•  Show the output of the worker, including errors and per-epoch loss and validation accuracy, live in the Training log.</w:t>
-      </w:r>
-    </w:p>
-    <w:p>
-      <w:pPr>
-        <w:pStyle w:val="ListParagraph"/>
-        <w:ind w:left="360" w:hanging="240"/>
-        <w:rPr>
-          <w:lang w:val="en-GB"/>
-        </w:rPr>
-      </w:pPr>
-      <w:r>
-        <w:rPr>
-          <w:lang w:val="en-GB"/>
-        </w:rPr>
-        <w:t>•  Stop a running training with the Stop button or by closing the dialog.</w:t>
-      </w:r>
-    </w:p>
-    <w:p>
-      <w:pPr>
-        <w:pStyle w:val="ListParagraph"/>
-        <w:ind w:left="360" w:hanging="240"/>
-        <w:rPr>
-          <w:lang w:val="en-GB"/>
-        </w:rPr>
-      </w:pPr>
-      <w:r>
-        <w:rPr>
-          <w:lang w:val="en-GB"/>
-        </w:rPr>
-        <w:t>•  Split training and validation by source video and refuse to train when a species has fewer than two source videos.</w:t>
-      </w:r>
-    </w:p>
-    <w:p>
-      <w:pPr>
-        <w:pStyle w:val="ListParagraph"/>
-        <w:ind w:left="360" w:hanging="240"/>
-        <w:rPr>
-          <w:lang w:val="en-GB"/>
-        </w:rPr>
-      </w:pPr>
-      <w:r>
-        <w:rPr>
-          <w:lang w:val="en-GB"/>
-        </w:rPr>
-        <w:t>•  Write an ONNX model and a sibling .labels.json file with class order, species names, preprocessing information and validation accuracy.</w:t>
-      </w:r>
-    </w:p>
-    <w:p>
-      <w:pPr>
-        <w:pStyle w:val="ListParagraph"/>
-        <w:ind w:left="360" w:hanging="240"/>
-        <w:rPr>
-          <w:lang w:val="en-GB"/>
-        </w:rPr>
-      </w:pPr>
-      <w:r>
-        <w:rPr>
-          <w:lang w:val="en-GB"/>
-        </w:rPr>
-        <w:t>•  Use a GPU through CUDA when available, otherwise the CPU.</w:t>
-      </w:r>
-    </w:p>
-    <w:p>
-      <w:pPr>
-        <w:pStyle w:val="ListParagraph"/>
-        <w:ind w:left="360" w:hanging="240"/>
-        <w:rPr>
-          <w:lang w:val="en-GB"/>
-        </w:rPr>
-      </w:pPr>
-      <w:r>
-        <w:rPr>
-          <w:lang w:val="en-GB"/>
-        </w:rPr>
-        <w:t>•  Build in Debug and Release for x64.</w:t>
+        <w:t>•  validation_accuracy is the share of validation crops that were classified correctly. The validation crops come from videos the model was not trained on, so the figure says how well the model copes with a new video. It is a diagnostic and not a guarantee of field accuracy; see section 1.8.</w:t>
+      </w:r>
+    </w:p>
+    <w:p>
+      <w:pPr>
+        <w:pStyle w:val="ListParagraph"/>
+        <w:ind w:left="360" w:hanging="240"/>
+        <w:rPr>
+          <w:lang w:val="en-GB"/>
+        </w:rPr>
+      </w:pPr>
+      <w:r>
+        <w:rPr>
+          <w:lang w:val="en-GB"/>
+        </w:rPr>
+        <w:t>•  Keep the .onnx and the .labels.json files together. The label file is the only place where the outputs of the model are tied to species names.</w:t>
+      </w:r>
+    </w:p>
+    <w:p>
+      <w:pPr>
+        <w:pStyle w:val="ListParagraph"/>
+        <w:ind w:left="360" w:hanging="240"/>
+        <w:rPr>
+          <w:lang w:val="en-GB"/>
+        </w:rPr>
+      </w:pPr>
+      <w:r>
+        <w:rPr>
+          <w:lang w:val="en-GB"/>
+        </w:rPr>
+        <w:t>•  The model is only as good as the labelled data. If a species is often confused with another, add more crops of both from more videos and train again.</w:t>
       </w:r>
     </w:p>
     <w:p>
@@ -3278,20 +4177,44 @@
           <w:lang w:val="en-GB"/>
         </w:rPr>
       </w:pPr>
-      <w:bookmarkStart w:id="31" w:name="_Toc900016"/>
-      <w:bookmarkStart w:id="32" w:name="_Toc244109515"/>
-      <w:r>
-        <w:rPr>
-          <w:lang w:val="en-GB"/>
-        </w:rPr>
-        <w:t>2.2 Change log</w:t>
+      <w:bookmarkStart w:id="31" w:name="_Toc244110573"/>
+      <w:r>
+        <w:rPr>
+          <w:lang w:val="en-GB"/>
+        </w:rPr>
+        <w:t>2.5 Running the worker from a terminal</w:t>
       </w:r>
       <w:bookmarkEnd w:id="31"/>
-      <w:bookmarkEnd w:id="32"/>
+    </w:p>
+    <w:p>
+      <w:pPr>
+        <w:rPr>
+          <w:lang w:val="en-GB"/>
+        </w:rPr>
+      </w:pPr>
+      <w:r>
+        <w:rPr>
+          <w:lang w:val="en-GB"/>
+        </w:rPr>
+        <w:t>The dialog is a front end for train_species.py, and the same work can be started directly. This is useful for the settings that are not in the dialog, for a computer without the dialog, and when the log is to be saved to a file:</w:t>
+      </w:r>
+    </w:p>
+    <w:p>
+      <w:pPr>
+        <w:rPr>
+          <w:lang w:val="en-GB"/>
+        </w:rPr>
+      </w:pPr>
+      <w:r>
+        <w:rPr>
+          <w:lang w:val="en-GB"/>
+        </w:rPr>
+        <w:t>python train_species.py --dataset C:\data\bird-export --output C:\models\birds.onnx --epochs 10 --batch-size 16</w:t>
+      </w:r>
     </w:p>
     <w:tbl>
       <w:tblPr>
-        <w:tblW w:w="0" w:type="auto"/>
+        <w:tblW w:w="9060" w:type="dxa"/>
         <w:tblBorders>
           <w:top w:val="single" w:sz="4" w:space="0" w:color="808080"/>
           <w:left w:val="single" w:sz="4" w:space="0" w:color="808080"/>
@@ -3300,36 +4223,51 @@
           <w:insideH w:val="single" w:sz="4" w:space="0" w:color="808080"/>
           <w:insideV w:val="single" w:sz="4" w:space="0" w:color="808080"/>
         </w:tblBorders>
+        <w:tblLayout w:type="fixed"/>
         <w:tblLook w:val="04A0" w:firstRow="1" w:lastRow="0" w:firstColumn="1" w:lastColumn="0" w:noHBand="0" w:noVBand="1"/>
       </w:tblPr>
       <w:tblGrid>
-        <w:gridCol w:w="4528"/>
-        <w:gridCol w:w="4534"/>
+        <w:gridCol w:w="2000"/>
+        <w:gridCol w:w="1500"/>
+        <w:gridCol w:w="5560"/>
       </w:tblGrid>
       <w:tr>
         <w:tc>
           <w:tcPr>
-            <w:tcW w:w="4536" w:type="dxa"/>
+            <w:tcW w:w="2000" w:type="dxa"/>
           </w:tcPr>
           <w:p>
             <w:r>
               <w:rPr>
                 <w:b/>
               </w:rPr>
-              <w:t>Request</w:t>
-            </w:r>
-          </w:p>
-        </w:tc>
-        <w:tc>
-          <w:tcPr>
-            <w:tcW w:w="4536" w:type="dxa"/>
+              <w:t>Option</w:t>
+            </w:r>
+          </w:p>
+        </w:tc>
+        <w:tc>
+          <w:tcPr>
+            <w:tcW w:w="1500" w:type="dxa"/>
           </w:tcPr>
           <w:p>
             <w:r>
               <w:rPr>
                 <w:b/>
               </w:rPr>
-              <w:t>Capability added</w:t>
+              <w:t>Default</w:t>
+            </w:r>
+          </w:p>
+        </w:tc>
+        <w:tc>
+          <w:tcPr>
+            <w:tcW w:w="5560" w:type="dxa"/>
+          </w:tcPr>
+          <w:p>
+            <w:r>
+              <w:rPr>
+                <w:b/>
+              </w:rPr>
+              <w:t>Meaning</w:t>
             </w:r>
           </w:p>
         </w:tc>
@@ -3337,17 +4275,27 @@
       <w:tr>
         <w:tc>
           <w:tcPr>
-            <w:tcW w:w="4536" w:type="dxa"/>
-          </w:tcPr>
-          <w:p>
-            <w:r>
-              <w:t>1</w:t>
-            </w:r>
-          </w:p>
-        </w:tc>
-        <w:tc>
-          <w:tcPr>
-            <w:tcW w:w="4536" w:type="dxa"/>
+            <w:tcW w:w="2000" w:type="dxa"/>
+          </w:tcPr>
+          <w:p>
+            <w:r>
+              <w:t>--dataset</w:t>
+            </w:r>
+          </w:p>
+        </w:tc>
+        <w:tc>
+          <w:tcPr>
+            <w:tcW w:w="1500" w:type="dxa"/>
+          </w:tcPr>
+          <w:p>
+            <w:r>
+              <w:t>(required)</w:t>
+            </w:r>
+          </w:p>
+        </w:tc>
+        <w:tc>
+          <w:tcPr>
+            <w:tcW w:w="5560" w:type="dxa"/>
           </w:tcPr>
           <w:p>
             <w:pPr>
@@ -3359,7 +4307,7 @@
               <w:rPr>
                 <w:lang w:val="en-GB"/>
               </w:rPr>
-              <w:t>Separate dialog-based MFC application SpeciesModelTrainer with the Python/PyTorch worker train_species.py, ONNX export and label file.</w:t>
+              <w:t>The export folder that contains manifest.csv.</w:t>
             </w:r>
           </w:p>
         </w:tc>
@@ -3367,17 +4315,27 @@
       <w:tr>
         <w:tc>
           <w:tcPr>
-            <w:tcW w:w="4536" w:type="dxa"/>
-          </w:tcPr>
-          <w:p>
-            <w:r>
-              <w:t>2</w:t>
-            </w:r>
-          </w:p>
-        </w:tc>
-        <w:tc>
-          <w:tcPr>
-            <w:tcW w:w="4536" w:type="dxa"/>
+            <w:tcW w:w="2000" w:type="dxa"/>
+          </w:tcPr>
+          <w:p>
+            <w:r>
+              <w:t>--output</w:t>
+            </w:r>
+          </w:p>
+        </w:tc>
+        <w:tc>
+          <w:tcPr>
+            <w:tcW w:w="1500" w:type="dxa"/>
+          </w:tcPr>
+          <w:p>
+            <w:r>
+              <w:t>(required)</w:t>
+            </w:r>
+          </w:p>
+        </w:tc>
+        <w:tc>
+          <w:tcPr>
+            <w:tcW w:w="5560" w:type="dxa"/>
           </w:tcPr>
           <w:p>
             <w:pPr>
@@ -3389,7 +4347,7 @@
               <w:rPr>
                 <w:lang w:val="en-GB"/>
               </w:rPr>
-              <w:t>Troubleshooting section in SpeciesModelTrainer/README.md: where failures are reported (Training log) and the fix for missing Python modules.</w:t>
+              <w:t>The ONNX file to write; the label file is written beside it.</w:t>
             </w:r>
           </w:p>
         </w:tc>
@@ -3397,17 +4355,27 @@
       <w:tr>
         <w:tc>
           <w:tcPr>
-            <w:tcW w:w="4536" w:type="dxa"/>
-          </w:tcPr>
-          <w:p>
-            <w:r>
-              <w:t>3</w:t>
-            </w:r>
-          </w:p>
-        </w:tc>
-        <w:tc>
-          <w:tcPr>
-            <w:tcW w:w="4536" w:type="dxa"/>
+            <w:tcW w:w="2000" w:type="dxa"/>
+          </w:tcPr>
+          <w:p>
+            <w:r>
+              <w:t>--epochs</w:t>
+            </w:r>
+          </w:p>
+        </w:tc>
+        <w:tc>
+          <w:tcPr>
+            <w:tcW w:w="1500" w:type="dxa"/>
+          </w:tcPr>
+          <w:p>
+            <w:r>
+              <w:t>10</w:t>
+            </w:r>
+          </w:p>
+        </w:tc>
+        <w:tc>
+          <w:tcPr>
+            <w:tcW w:w="5560" w:type="dxa"/>
           </w:tcPr>
           <w:p>
             <w:pPr>
@@ -3419,7 +4387,287 @@
               <w:rPr>
                 <w:lang w:val="en-GB"/>
               </w:rPr>
-              <w:t>This document, TrainerApplication.docx: architecture, how the export maps to the ONNX model, and the error reporting.</w:t>
+              <w:t>Number of passes over the training data.</w:t>
+            </w:r>
+          </w:p>
+        </w:tc>
+      </w:tr>
+      <w:tr>
+        <w:tc>
+          <w:tcPr>
+            <w:tcW w:w="2000" w:type="dxa"/>
+          </w:tcPr>
+          <w:p>
+            <w:r>
+              <w:t>--batch-size</w:t>
+            </w:r>
+          </w:p>
+        </w:tc>
+        <w:tc>
+          <w:tcPr>
+            <w:tcW w:w="1500" w:type="dxa"/>
+          </w:tcPr>
+          <w:p>
+            <w:r>
+              <w:t>16</w:t>
+            </w:r>
+          </w:p>
+        </w:tc>
+        <w:tc>
+          <w:tcPr>
+            <w:tcW w:w="5560" w:type="dxa"/>
+          </w:tcPr>
+          <w:p>
+            <w:pPr>
+              <w:rPr>
+                <w:lang w:val="en-GB"/>
+              </w:rPr>
+            </w:pPr>
+            <w:r>
+              <w:rPr>
+                <w:lang w:val="en-GB"/>
+              </w:rPr>
+              <w:t>Images per step.</w:t>
+            </w:r>
+          </w:p>
+        </w:tc>
+      </w:tr>
+      <w:tr>
+        <w:tc>
+          <w:tcPr>
+            <w:tcW w:w="2000" w:type="dxa"/>
+          </w:tcPr>
+          <w:p>
+            <w:r>
+              <w:t>--learning-rate</w:t>
+            </w:r>
+          </w:p>
+        </w:tc>
+        <w:tc>
+          <w:tcPr>
+            <w:tcW w:w="1500" w:type="dxa"/>
+          </w:tcPr>
+          <w:p>
+            <w:r>
+              <w:t>0.0001</w:t>
+            </w:r>
+          </w:p>
+        </w:tc>
+        <w:tc>
+          <w:tcPr>
+            <w:tcW w:w="5560" w:type="dxa"/>
+          </w:tcPr>
+          <w:p>
+            <w:pPr>
+              <w:rPr>
+                <w:lang w:val="en-GB"/>
+              </w:rPr>
+            </w:pPr>
+            <w:r>
+              <w:rPr>
+                <w:lang w:val="en-GB"/>
+              </w:rPr>
+              <w:t>Step size of the AdamW optimizer; must be positive.</w:t>
+            </w:r>
+          </w:p>
+        </w:tc>
+      </w:tr>
+      <w:tr>
+        <w:tc>
+          <w:tcPr>
+            <w:tcW w:w="2000" w:type="dxa"/>
+          </w:tcPr>
+          <w:p>
+            <w:r>
+              <w:t>--validation</w:t>
+            </w:r>
+          </w:p>
+        </w:tc>
+        <w:tc>
+          <w:tcPr>
+            <w:tcW w:w="1500" w:type="dxa"/>
+          </w:tcPr>
+          <w:p>
+            <w:r>
+              <w:t>0.2</w:t>
+            </w:r>
+          </w:p>
+        </w:tc>
+        <w:tc>
+          <w:tcPr>
+            <w:tcW w:w="5560" w:type="dxa"/>
+          </w:tcPr>
+          <w:p>
+            <w:pPr>
+              <w:rPr>
+                <w:lang w:val="en-GB"/>
+              </w:rPr>
+            </w:pPr>
+            <w:r>
+              <w:rPr>
+                <w:lang w:val="en-GB"/>
+              </w:rPr>
+              <w:t>Approximate share of source videos used for validation, between 0.05 and 0.5.</w:t>
+            </w:r>
+          </w:p>
+        </w:tc>
+      </w:tr>
+      <w:tr>
+        <w:tc>
+          <w:tcPr>
+            <w:tcW w:w="2000" w:type="dxa"/>
+          </w:tcPr>
+          <w:p>
+            <w:r>
+              <w:t>--seed</w:t>
+            </w:r>
+          </w:p>
+        </w:tc>
+        <w:tc>
+          <w:tcPr>
+            <w:tcW w:w="1500" w:type="dxa"/>
+          </w:tcPr>
+          <w:p>
+            <w:r>
+              <w:t>42</w:t>
+            </w:r>
+          </w:p>
+        </w:tc>
+        <w:tc>
+          <w:tcPr>
+            <w:tcW w:w="5560" w:type="dxa"/>
+          </w:tcPr>
+          <w:p>
+            <w:pPr>
+              <w:rPr>
+                <w:lang w:val="en-GB"/>
+              </w:rPr>
+            </w:pPr>
+            <w:r>
+              <w:rPr>
+                <w:lang w:val="en-GB"/>
+              </w:rPr>
+              <w:t>Random seed; the same seed gives the same split.</w:t>
+            </w:r>
+          </w:p>
+        </w:tc>
+      </w:tr>
+      <w:tr>
+        <w:tc>
+          <w:tcPr>
+            <w:tcW w:w="2000" w:type="dxa"/>
+          </w:tcPr>
+          <w:p>
+            <w:r>
+              <w:t>--threads</w:t>
+            </w:r>
+          </w:p>
+        </w:tc>
+        <w:tc>
+          <w:tcPr>
+            <w:tcW w:w="1500" w:type="dxa"/>
+          </w:tcPr>
+          <w:p>
+            <w:r>
+              <w:t>4</w:t>
+            </w:r>
+          </w:p>
+        </w:tc>
+        <w:tc>
+          <w:tcPr>
+            <w:tcW w:w="5560" w:type="dxa"/>
+          </w:tcPr>
+          <w:p>
+            <w:pPr>
+              <w:rPr>
+                <w:lang w:val="en-GB"/>
+              </w:rPr>
+            </w:pPr>
+            <w:r>
+              <w:rPr>
+                <w:lang w:val="en-GB"/>
+              </w:rPr>
+              <w:t>CPU threads used by PyTorch.</w:t>
+            </w:r>
+          </w:p>
+        </w:tc>
+      </w:tr>
+      <w:tr>
+        <w:tc>
+          <w:tcPr>
+            <w:tcW w:w="2000" w:type="dxa"/>
+          </w:tcPr>
+          <w:p>
+            <w:r>
+              <w:t>--cpu</w:t>
+            </w:r>
+          </w:p>
+        </w:tc>
+        <w:tc>
+          <w:tcPr>
+            <w:tcW w:w="1500" w:type="dxa"/>
+          </w:tcPr>
+          <w:p>
+            <w:r>
+              <w:t>off</w:t>
+            </w:r>
+          </w:p>
+        </w:tc>
+        <w:tc>
+          <w:tcPr>
+            <w:tcW w:w="5560" w:type="dxa"/>
+          </w:tcPr>
+          <w:p>
+            <w:pPr>
+              <w:rPr>
+                <w:lang w:val="en-GB"/>
+              </w:rPr>
+            </w:pPr>
+            <w:r>
+              <w:rPr>
+                <w:lang w:val="en-GB"/>
+              </w:rPr>
+              <w:t>Train on the CPU even if a CUDA GPU is available.</w:t>
+            </w:r>
+          </w:p>
+        </w:tc>
+      </w:tr>
+      <w:tr>
+        <w:tc>
+          <w:tcPr>
+            <w:tcW w:w="2000" w:type="dxa"/>
+          </w:tcPr>
+          <w:p>
+            <w:r>
+              <w:t>--no-pretrained</w:t>
+            </w:r>
+          </w:p>
+        </w:tc>
+        <w:tc>
+          <w:tcPr>
+            <w:tcW w:w="1500" w:type="dxa"/>
+          </w:tcPr>
+          <w:p>
+            <w:r>
+              <w:t>off</w:t>
+            </w:r>
+          </w:p>
+        </w:tc>
+        <w:tc>
+          <w:tcPr>
+            <w:tcW w:w="5560" w:type="dxa"/>
+          </w:tcPr>
+          <w:p>
+            <w:pPr>
+              <w:rPr>
+                <w:lang w:val="en-GB"/>
+              </w:rPr>
+            </w:pPr>
+            <w:r>
+              <w:rPr>
+                <w:lang w:val="en-GB"/>
+              </w:rPr>
+              <w:t>Start from random weights instead of ImageNet weights. Needs much more data and no download.</w:t>
             </w:r>
           </w:p>
         </w:tc>
@@ -3434,23 +4682,488 @@
     </w:p>
     <w:p>
       <w:pPr>
+        <w:rPr>
+          <w:lang w:val="en-GB"/>
+        </w:rPr>
+      </w:pPr>
+      <w:r>
+        <w:rPr>
+          <w:lang w:val="en-GB"/>
+        </w:rPr>
+        <w:t>In a terminal the output appears in the console, so it can be redirected to a file, for example by adding &gt; train.log 2&gt;&amp;1 to the command.</w:t>
+      </w:r>
+    </w:p>
+    <w:p>
+      <w:pPr>
         <w:pStyle w:val="Heading2"/>
         <w:rPr>
           <w:lang w:val="en-GB"/>
         </w:rPr>
       </w:pPr>
-      <w:bookmarkStart w:id="33" w:name="_Toc244024231"/>
-      <w:bookmarkStart w:id="34" w:name="_Toc900017"/>
-      <w:bookmarkStart w:id="35" w:name="_Toc244109516"/>
-      <w:r>
-        <w:rPr>
-          <w:lang w:val="en-GB"/>
-        </w:rPr>
-        <w:t>2.3 Possible improvements</w:t>
+      <w:bookmarkStart w:id="32" w:name="_Toc244110574"/>
+      <w:r>
+        <w:rPr>
+          <w:lang w:val="en-GB"/>
+        </w:rPr>
+        <w:t>2.6 Training again</w:t>
+      </w:r>
+      <w:bookmarkEnd w:id="32"/>
+    </w:p>
+    <w:p>
+      <w:pPr>
+        <w:rPr>
+          <w:lang w:val="en-GB"/>
+        </w:rPr>
+      </w:pPr>
+      <w:r>
+        <w:rPr>
+          <w:lang w:val="en-GB"/>
+        </w:rPr>
+        <w:t>A new model is trained from scratch (or rather from the ImageNet weights) every time; earlier models are not updated. When new crops have been labelled, or a species has been added, export the dataset again and train again. Use a new output file name if the earlier model is to be kept for comparison. The validation accuracy of different runs is only comparable when the same data and the same seed are used.</w:t>
+      </w:r>
+    </w:p>
+    <w:p>
+      <w:pPr>
+        <w:pStyle w:val="Heading1"/>
+        <w:rPr>
+          <w:lang w:val="en-GB"/>
+        </w:rPr>
+      </w:pPr>
+      <w:bookmarkStart w:id="33" w:name="_Toc244024230"/>
+      <w:bookmarkStart w:id="34" w:name="_Toc900014"/>
+      <w:bookmarkStart w:id="35" w:name="_Toc244110575"/>
+      <w:r>
+        <w:rPr>
+          <w:lang w:val="en-GB"/>
+        </w:rPr>
+        <w:t>3. Capabilities of the application</w:t>
       </w:r>
       <w:bookmarkEnd w:id="33"/>
       <w:bookmarkEnd w:id="34"/>
       <w:bookmarkEnd w:id="35"/>
+    </w:p>
+    <w:p>
+      <w:pPr>
+        <w:rPr>
+          <w:lang w:val="en-GB"/>
+        </w:rPr>
+      </w:pPr>
+      <w:r>
+        <w:rPr>
+          <w:lang w:val="en-GB"/>
+        </w:rPr>
+        <w:t>This section lists what the application can do. It is updated whenever a new request is implemented.</w:t>
+      </w:r>
+    </w:p>
+    <w:p>
+      <w:pPr>
+        <w:pStyle w:val="Heading2"/>
+        <w:rPr>
+          <w:lang w:val="en-GB"/>
+        </w:rPr>
+      </w:pPr>
+      <w:bookmarkStart w:id="36" w:name="_Toc900015"/>
+      <w:bookmarkStart w:id="37" w:name="_Toc244110576"/>
+      <w:r>
+        <w:rPr>
+          <w:lang w:val="en-GB"/>
+        </w:rPr>
+        <w:t>3.1 Current capabilities</w:t>
+      </w:r>
+      <w:bookmarkEnd w:id="36"/>
+      <w:bookmarkEnd w:id="37"/>
+    </w:p>
+    <w:p>
+      <w:pPr>
+        <w:pStyle w:val="ListParagraph"/>
+        <w:ind w:left="360" w:hanging="240"/>
+        <w:rPr>
+          <w:lang w:val="en-GB"/>
+        </w:rPr>
+      </w:pPr>
+      <w:r>
+        <w:rPr>
+          <w:lang w:val="en-GB"/>
+        </w:rPr>
+        <w:t>•  Select a dataset export folder (File &gt; Export dataset output from AIML_ImageExtractor) and an output .onnx path with browse dialogs.</w:t>
+      </w:r>
+    </w:p>
+    <w:p>
+      <w:pPr>
+        <w:pStyle w:val="ListParagraph"/>
+        <w:ind w:left="360" w:hanging="240"/>
+        <w:rPr>
+          <w:lang w:val="en-GB"/>
+        </w:rPr>
+      </w:pPr>
+      <w:r>
+        <w:rPr>
+          <w:lang w:val="en-GB"/>
+        </w:rPr>
+        <w:t>•  Set the number of epochs and the batch size; both are validated before a run starts.</w:t>
+      </w:r>
+    </w:p>
+    <w:p>
+      <w:pPr>
+        <w:pStyle w:val="ListParagraph"/>
+        <w:ind w:left="360" w:hanging="240"/>
+        <w:rPr>
+          <w:lang w:val="en-GB"/>
+        </w:rPr>
+      </w:pPr>
+      <w:r>
+        <w:rPr>
+          <w:lang w:val="en-GB"/>
+        </w:rPr>
+        <w:t>•  Train a ResNet18 species classifier with ImageNet pretrained weights in a separate Python process while the dialog stays responsive.</w:t>
+      </w:r>
+    </w:p>
+    <w:p>
+      <w:pPr>
+        <w:pStyle w:val="ListParagraph"/>
+        <w:ind w:left="360" w:hanging="240"/>
+        <w:rPr>
+          <w:lang w:val="en-GB"/>
+        </w:rPr>
+      </w:pPr>
+      <w:r>
+        <w:rPr>
+          <w:lang w:val="en-GB"/>
+        </w:rPr>
+        <w:t>•  Show the output of the worker, including errors and per-epoch loss and validation accuracy, live in the Training log.</w:t>
+      </w:r>
+    </w:p>
+    <w:p>
+      <w:pPr>
+        <w:pStyle w:val="ListParagraph"/>
+        <w:ind w:left="360" w:hanging="240"/>
+        <w:rPr>
+          <w:lang w:val="en-GB"/>
+        </w:rPr>
+      </w:pPr>
+      <w:r>
+        <w:rPr>
+          <w:lang w:val="en-GB"/>
+        </w:rPr>
+        <w:t>•  Stop a running training with the Stop button or by closing the dialog.</w:t>
+      </w:r>
+    </w:p>
+    <w:p>
+      <w:pPr>
+        <w:pStyle w:val="ListParagraph"/>
+        <w:ind w:left="360" w:hanging="240"/>
+        <w:rPr>
+          <w:lang w:val="en-GB"/>
+        </w:rPr>
+      </w:pPr>
+      <w:r>
+        <w:rPr>
+          <w:lang w:val="en-GB"/>
+        </w:rPr>
+        <w:t>•  Split training and validation by source video and refuse to train when a species has fewer than two source videos.</w:t>
+      </w:r>
+    </w:p>
+    <w:p>
+      <w:pPr>
+        <w:pStyle w:val="ListParagraph"/>
+        <w:ind w:left="360" w:hanging="240"/>
+        <w:rPr>
+          <w:lang w:val="en-GB"/>
+        </w:rPr>
+      </w:pPr>
+      <w:r>
+        <w:rPr>
+          <w:lang w:val="en-GB"/>
+        </w:rPr>
+        <w:t>•  Write an ONNX model and a sibling .labels.json file with class order, species names, preprocessing information and validation accuracy.</w:t>
+      </w:r>
+    </w:p>
+    <w:p>
+      <w:pPr>
+        <w:pStyle w:val="ListParagraph"/>
+        <w:ind w:left="360" w:hanging="240"/>
+        <w:rPr>
+          <w:lang w:val="en-GB"/>
+        </w:rPr>
+      </w:pPr>
+      <w:r>
+        <w:rPr>
+          <w:lang w:val="en-GB"/>
+        </w:rPr>
+        <w:t>•  Use a GPU through CUDA when available, otherwise the CPU.</w:t>
+      </w:r>
+    </w:p>
+    <w:p>
+      <w:pPr>
+        <w:pStyle w:val="ListParagraph"/>
+        <w:ind w:left="360" w:hanging="240"/>
+        <w:rPr>
+          <w:lang w:val="en-GB"/>
+        </w:rPr>
+      </w:pPr>
+      <w:r>
+        <w:rPr>
+          <w:lang w:val="en-GB"/>
+        </w:rPr>
+        <w:t>•  Documented use: a step by step guide, advice on epochs and batch size, and the command-line options of the worker.</w:t>
+      </w:r>
+    </w:p>
+    <w:p>
+      <w:pPr>
+        <w:pStyle w:val="ListParagraph"/>
+        <w:ind w:left="360" w:hanging="240"/>
+        <w:rPr>
+          <w:lang w:val="en-GB"/>
+        </w:rPr>
+      </w:pPr>
+      <w:r>
+        <w:rPr>
+          <w:lang w:val="en-GB"/>
+        </w:rPr>
+        <w:t>•  Build in Debug and Release for x64.</w:t>
+      </w:r>
+    </w:p>
+    <w:p>
+      <w:pPr>
+        <w:pStyle w:val="Heading2"/>
+        <w:rPr>
+          <w:lang w:val="en-GB"/>
+        </w:rPr>
+      </w:pPr>
+      <w:bookmarkStart w:id="38" w:name="_Toc900016"/>
+      <w:bookmarkStart w:id="39" w:name="_Toc244110577"/>
+      <w:r>
+        <w:rPr>
+          <w:lang w:val="en-GB"/>
+        </w:rPr>
+        <w:t>3.2 Change log</w:t>
+      </w:r>
+      <w:bookmarkEnd w:id="38"/>
+      <w:bookmarkEnd w:id="39"/>
+    </w:p>
+    <w:tbl>
+      <w:tblPr>
+        <w:tblW w:w="9060" w:type="dxa"/>
+        <w:tblBorders>
+          <w:top w:val="single" w:sz="4" w:space="0" w:color="808080"/>
+          <w:left w:val="single" w:sz="4" w:space="0" w:color="808080"/>
+          <w:bottom w:val="single" w:sz="4" w:space="0" w:color="808080"/>
+          <w:right w:val="single" w:sz="4" w:space="0" w:color="808080"/>
+          <w:insideH w:val="single" w:sz="4" w:space="0" w:color="808080"/>
+          <w:insideV w:val="single" w:sz="4" w:space="0" w:color="808080"/>
+        </w:tblBorders>
+        <w:tblLayout w:type="fixed"/>
+        <w:tblLook w:val="04A0" w:firstRow="1" w:lastRow="0" w:firstColumn="1" w:lastColumn="0" w:noHBand="0" w:noVBand="1"/>
+      </w:tblPr>
+      <w:tblGrid>
+        <w:gridCol w:w="900"/>
+        <w:gridCol w:w="8160"/>
+      </w:tblGrid>
+      <w:tr>
+        <w:tc>
+          <w:tcPr>
+            <w:tcW w:w="900" w:type="dxa"/>
+          </w:tcPr>
+          <w:p>
+            <w:r>
+              <w:rPr>
+                <w:b/>
+              </w:rPr>
+              <w:t>Request</w:t>
+            </w:r>
+          </w:p>
+        </w:tc>
+        <w:tc>
+          <w:tcPr>
+            <w:tcW w:w="8160" w:type="dxa"/>
+          </w:tcPr>
+          <w:p>
+            <w:r>
+              <w:rPr>
+                <w:b/>
+              </w:rPr>
+              <w:t>Capability added</w:t>
+            </w:r>
+          </w:p>
+        </w:tc>
+      </w:tr>
+      <w:tr>
+        <w:tc>
+          <w:tcPr>
+            <w:tcW w:w="900" w:type="dxa"/>
+          </w:tcPr>
+          <w:p>
+            <w:r>
+              <w:t>1</w:t>
+            </w:r>
+          </w:p>
+        </w:tc>
+        <w:tc>
+          <w:tcPr>
+            <w:tcW w:w="8160" w:type="dxa"/>
+          </w:tcPr>
+          <w:p>
+            <w:pPr>
+              <w:rPr>
+                <w:lang w:val="en-GB"/>
+              </w:rPr>
+            </w:pPr>
+            <w:r>
+              <w:rPr>
+                <w:lang w:val="en-GB"/>
+              </w:rPr>
+              <w:t>Separate dialog-based MFC application SpeciesModelTrainer with the Python/PyTorch worker train_species.py, ONNX export and label file.</w:t>
+            </w:r>
+          </w:p>
+        </w:tc>
+      </w:tr>
+      <w:tr>
+        <w:tc>
+          <w:tcPr>
+            <w:tcW w:w="900" w:type="dxa"/>
+          </w:tcPr>
+          <w:p>
+            <w:r>
+              <w:t>2</w:t>
+            </w:r>
+          </w:p>
+        </w:tc>
+        <w:tc>
+          <w:tcPr>
+            <w:tcW w:w="8160" w:type="dxa"/>
+          </w:tcPr>
+          <w:p>
+            <w:pPr>
+              <w:rPr>
+                <w:lang w:val="en-GB"/>
+              </w:rPr>
+            </w:pPr>
+            <w:r>
+              <w:rPr>
+                <w:lang w:val="en-GB"/>
+              </w:rPr>
+              <w:t>Troubleshooting section in SpeciesModelTrainer/README.md: where failures are reported (Training log) and the fix for missing Python modules.</w:t>
+            </w:r>
+          </w:p>
+        </w:tc>
+      </w:tr>
+      <w:tr>
+        <w:tc>
+          <w:tcPr>
+            <w:tcW w:w="900" w:type="dxa"/>
+          </w:tcPr>
+          <w:p>
+            <w:r>
+              <w:t>3</w:t>
+            </w:r>
+          </w:p>
+        </w:tc>
+        <w:tc>
+          <w:tcPr>
+            <w:tcW w:w="8160" w:type="dxa"/>
+          </w:tcPr>
+          <w:p>
+            <w:pPr>
+              <w:rPr>
+                <w:lang w:val="en-GB"/>
+              </w:rPr>
+            </w:pPr>
+            <w:r>
+              <w:rPr>
+                <w:lang w:val="en-GB"/>
+              </w:rPr>
+              <w:t>This document, TrainerApplication.docx: architecture, how the export maps to the ONNX model, and the error reporting.</w:t>
+            </w:r>
+          </w:p>
+        </w:tc>
+      </w:tr>
+      <w:tr>
+        <w:tc>
+          <w:tcPr>
+            <w:tcW w:w="900" w:type="dxa"/>
+          </w:tcPr>
+          <w:p>
+            <w:r>
+              <w:t>4</w:t>
+            </w:r>
+          </w:p>
+        </w:tc>
+        <w:tc>
+          <w:tcPr>
+            <w:tcW w:w="8160" w:type="dxa"/>
+          </w:tcPr>
+          <w:p>
+            <w:pPr>
+              <w:rPr>
+                <w:lang w:val="en-GB"/>
+              </w:rPr>
+            </w:pPr>
+            <w:r>
+              <w:rPr>
+                <w:lang w:val="en-GB"/>
+              </w:rPr>
+              <w:t>Chapter 2, Using the trainer application: preparation, step by step use, choosing settings, reading the result, running the worker from a terminal, and training again.</w:t>
+            </w:r>
+          </w:p>
+        </w:tc>
+      </w:tr>
+      <w:tr>
+        <w:tc>
+          <w:tcPr>
+            <w:tcW w:w="900" w:type="dxa"/>
+          </w:tcPr>
+          <w:p>
+            <w:r>
+              <w:t>5</w:t>
+            </w:r>
+          </w:p>
+        </w:tc>
+        <w:tc>
+          <w:tcPr>
+            <w:tcW w:w="8160" w:type="dxa"/>
+          </w:tcPr>
+          <w:p>
+            <w:pPr>
+              <w:rPr>
+                <w:lang w:val="en-GB"/>
+              </w:rPr>
+            </w:pPr>
+            <w:r>
+              <w:rPr>
+                <w:lang w:val="en-GB"/>
+              </w:rPr>
+              <w:t>Design choices added to the description of each internal part (classes, worker functions, threading, split, model, error reporting).</w:t>
+            </w:r>
+          </w:p>
+        </w:tc>
+      </w:tr>
+    </w:tbl>
+    <w:p>
+      <w:pPr>
+        <w:rPr>
+          <w:lang w:val="en-GB"/>
+        </w:rPr>
+      </w:pPr>
+    </w:p>
+    <w:p>
+      <w:pPr>
+        <w:pStyle w:val="Heading2"/>
+        <w:rPr>
+          <w:lang w:val="en-GB"/>
+        </w:rPr>
+      </w:pPr>
+      <w:bookmarkStart w:id="40" w:name="_Toc244024231"/>
+      <w:bookmarkStart w:id="41" w:name="_Toc900017"/>
+      <w:bookmarkStart w:id="42" w:name="_Toc244110578"/>
+      <w:r>
+        <w:rPr>
+          <w:lang w:val="en-GB"/>
+        </w:rPr>
+        <w:t>3.3 Possible improvements</w:t>
+      </w:r>
+      <w:bookmarkEnd w:id="40"/>
+      <w:bookmarkEnd w:id="41"/>
+      <w:bookmarkEnd w:id="42"/>
     </w:p>
     <w:p>
       <w:pPr>

</xml_diff>